<commit_message>
EDFS-10: Prepare verified pre-defense correction package
Assistant-prepared corrections requested by Dias Saqyp. Interview accounts are interviewer-reported. Academic authorship and peer or supervisor approval are not established by this commit; both students should review the package before submission.
</commit_message>
<xml_diff>
--- a/docs/EDFS_Report.docx
+++ b/docs/EDFS_Report.docx
@@ -41,12 +41,12 @@
     </w:p>
     <w:p>
       <w:r>
-        <w:t>Qazybai Ali</w:t>
+        <w:t>Қазыбай Әли Сәтбекұлы</w:t>
         <w:br/>
         <w:t>SE-2424</w:t>
         <w:br/>
         <w:br/>
-        <w:t>Saqyp Dias</w:t>
+        <w:t>Сақып Диас Мұратұлы</w:t>
         <w:br/>
         <w:t>SE-2417</w:t>
       </w:r>
@@ -78,14 +78,14 @@
         <w:br/>
         <w:t>Prepared 19 October 2026</w:t>
         <w:br/>
-        <w:t>Updated 22 October 2026</w:t>
+        <w:t>Updated 23 October 2026</w:t>
         <w:br/>
-        <w:t>Proposed requirements baseline 0.1</w:t>
+        <w:t>Proposed requirements baseline 0.2</w:t>
       </w:r>
     </w:p>
     <w:p>
       <w:r>
-        <w:t>This package contains the project proposal, source review, comparisons, testable requirements, architecture, prototype, evaluation plan and management materials. User discussions and supervisor feedback remain pending until their actual evidence is recorded.</w:t>
+        <w:t>This package contains the project proposal, source review, comparisons, testable requirements, architecture, prototype, evaluation plan and management materials. Dias Saqyp reports personally conducting ten user conversations in Astana on 12–19 October 2026; five directly relevant accounts are analysed below. Supervisor feedback and a reviewed submission tag remain outstanding.</w:t>
       </w:r>
     </w:p>
     <w:p>
@@ -103,7 +103,7 @@
     </w:p>
     <w:p>
       <w:r>
-        <w:t>The proposed solution is a small departmental document approval system. The current deliverable is analysis, design and an interactive browser prototype. The full application belongs to the later implementation phase. All assumptions, unmeasured targets and missing real-world evidence are identified in the relevant sections.</w:t>
+        <w:t>The proposed solution is a small departmental document approval system. The current deliverable is analysis, design and an interactive browser prototype. The full application belongs to the later implementation phase. User conversations inform the problem and expose a route-design gap; outcome measurements, supervisor review and the final scope decision remain open.</w:t>
       </w:r>
     </w:p>
     <w:p>
@@ -202,12 +202,12 @@
     </w:p>
     <w:p>
       <w:r>
-        <w:t>Title: Development of an Electronic Document Flow System. Students: Qazybai Ali, SE-2424, and Saqyp Dias, SE-2417. Supervisor: Askar Khaimuldin. Submission stage: first pre-defense, 24 October 2026. Working product name: EDFS.</w:t>
+        <w:t>Title: Development of an Electronic Document Flow System. Students: Қазыбай Әли Сәтбекұлы, SE-2424, and Сақып Диас Мұратұлы, SE-2417. Supervisor: Askar Khaimuldin. Submission stage: first pre-defense, 24 October 2026. Working product name: EDFS.</w:t>
       </w:r>
     </w:p>
     <w:p>
       <w:r>
-        <w:t>This package proposes a departmental web system that keeps a document, its versions and the decisions made about it together. It includes analysis, a proposed architecture, an interactive browser prototype and an evaluation plan. The organisation and its actual process have not yet been selected. The small-department setting is a design assumption that requires confirmation through interviews.</w:t>
+        <w:t>This package proposes a departmental web system that keeps a document, its versions and the decisions made about it together. It includes analysis, a proposed architecture, an interactive browser prototype and an evaluation plan. Ten user conversations were reported from Astana, but no pilot organisation or binding organisational policy has been selected. A small-department deployment remains a design assumption.</w:t>
       </w:r>
     </w:p>
     <w:p>
@@ -220,7 +220,7 @@
     </w:p>
     <w:p>
       <w:r>
-        <w:t>The working problem hypothesis is that employees who coordinate documents through separate files and messages can lose track of the current version, responsible reviewer and final decision. This has not been demonstrated in a real client organisation. Published EDMS and BPM studies justify investigating this class of problem, but do not verify the hypothesis for our users [S01–S03, S06].</w:t>
+        <w:t>Employees interviewed by Dias Saqyp described difficulty with document versions, current responsibility and approval history in their own processes (see Evidence of relevance). These accounts support investigating this problem; they do not establish its frequency across organisations or demonstrate benefit from the proposed system. Published EDMS and BPM studies provide broader context [S01–S03, S06].</w:t>
       </w:r>
     </w:p>
     <w:p>
@@ -244,13 +244,13 @@
     <w:p>
       <w:pPr/>
       <w:r>
-        <w:t>1. Validate the problem through 3–5 discussions with representatives of the proposed user roles, or a substantive client agreement.</w:t>
+        <w:t>1. Analyse five selected discussions with representatives of relevant internal document roles and use their accounts to refine scope and requirements.</w:t>
       </w:r>
     </w:p>
     <w:p>
       <w:pPr/>
       <w:r>
-        <w:t>2. Review scientific approaches and compare four existing products before confirming the project requirements.</w:t>
+        <w:t>2. Review scientific approaches and compare five existing products before confirming the project requirements.</w:t>
       </w:r>
     </w:p>
     <w:p>
@@ -287,12 +287,12 @@
     </w:p>
     <w:p>
       <w:r>
-        <w:t>In scope: internal documents, metadata search, immutable version snapshots, one assigned reviewer per submission, return with a reason, resubmission, approval of a specific version, archive, role and relationship checks, activity export and planned in-app notifications. Complexity comes from coordinating permissions, version consistency, concurrent decisions, durable audit events and recoverable storage.</w:t>
+        <w:t>The current prototype covers internal documents, metadata search, immutable version snapshots, one assigned reviewer per submission, return with a reason, resubmission, approval of a specific version, archive, role and relationship checks, and activity export. In-app notifications are planned for the later implementation. Complexity comes from permissions, version consistency, concurrent decisions, durable audit events and recoverable storage. The one-reviewer route is an implemented prototype limit, not evidence that one reviewer is sufficient in practice.</w:t>
       </w:r>
     </w:p>
     <w:p>
       <w:r>
-        <w:t>Out of scope for the initial system: legally qualified electronic signatures, state-service integration, public document exchange, OCR, AI classification, simultaneous editing, complex parallel or multi-level routes, and automated legal retention decisions. Approval is an operational decision, with no claim of legal signature equivalence. Existing approved records remain read-only. A later amendment creates a separate document linked to its predecessor.</w:t>
+        <w:t>Out of scope for the current prototype: legally qualified electronic signatures, state-service integration, public document exchange, OCR, AI classification, simultaneous editing, parallel routes and automated legal retention decisions. Several interviewees described sequential multi-stage approval. Whether that becomes a mandatory later implementation requirement needs a team and supervisor scope decision; it must not be described as implemented now. Approval is an operational decision, with no claim of legal signature equivalence.</w:t>
       </w:r>
     </w:p>
     <w:p>
@@ -310,7 +310,7 @@
     </w:p>
     <w:p>
       <w:r>
-        <w:t>The department can use a modern browser and nominate a reviewer and administrator. A single-stage route is sufficient for the first pilot. English labels are acceptable for the prototype. The team can learn the proposed backend stack. Each assumption must be accepted, revised or rejected in the evidence log after user and supervisor review.</w:t>
+        <w:t>A department can use a modern browser and nominate an administrator; the proposed pilot capacity of 10–30 users and the acceptability of English prototype labels still need confirmation. The previous assumption that a single-stage route would suffice is contradicted by several reported workflows. The team must either design staged approval for the later implementation or document an explicitly narrower pilot approved by the supervisor.</w:t>
       </w:r>
     </w:p>
     <w:p>
@@ -331,7 +331,37 @@
     </w:p>
     <w:p>
       <w:r>
-        <w:t>Verified inputs are the supplied committee checklist, the project title, the two students and their groups, and the supervisor name supplied by the user. External publications and official product documentation support the analysis. No interviews, client agreement, organisational observations or operational dataset were provided. Local relevance is therefore not yet verified and this criterion remains open.</w:t>
+        <w:t>Dias Saqyp reports personally conducting ten conversations with document-flow users in Astana from 12 to 19 October 2026. He supplied role-labelled notes about steps, delays, concrete incidents and status checks, plus the date and format of each conversation. He reports permission for anonymised quotations from all participants; the organisation in I04 must not be identified. These are interviewer-supplied summaries, not verbatim transcripts or independently verified organisational records. Five conversations most directly related to internal registration and approval are selected below.</w:t>
+      </w:r>
+    </w:p>
+    <w:p>
+      <w:pPr/>
+      <w:r>
+        <w:t>Selected discussion I01 — 12 October, in person, chief accountant in a medium-sized business. The participant described passing an act or contract through legal and executive review; an updated specification sent in another channel was missed, and status was sought through messages, calls or visits.</w:t>
+      </w:r>
+    </w:p>
+    <w:p>
+      <w:pPr/>
+      <w:r>
+        <w:t>Selected discussion I03 — 13 October, in person, records clerk in a large organisation. Paper or emailed internal documents were registered in a spreadsheet and passed to an executive. The clerk tracked handoffs manually and described documents waiting at that stage.</w:t>
+      </w:r>
+    </w:p>
+    <w:p>
+      <w:pPr/>
+      <w:r>
+        <w:t>Selected discussion I04 — 14 October, Telegram and email, contract lawyer. The participant described non-standard terms bypassing legal review and a draft with internal comments being sent for external signature. No organisation name or identifying detail is disclosed.</w:t>
+      </w:r>
+    </w:p>
+    <w:p>
+      <w:pPr/>
+      <w:r>
+        <w:t>Selected discussion I07 — 16 October, Slack, IT director. A purchasing note moved from initiator through IT, finance and chief executive review. Missing budget detail led to repeated correspondence; an obsolete specification had been used. Jira Service Desk already showed who held a task.</w:t>
+      </w:r>
+    </w:p>
+    <w:p>
+      <w:pPr/>
+      <w:r>
+        <w:t>Selected discussion I10 — 19 October, in person, chief financial officer. The participant described receiving a document without a clear record of prior approvals and approving an act before a technical concern reached finance.</w:t>
       </w:r>
     </w:p>
     <w:p>
@@ -718,7 +748,7 @@
                 <w:color w:val="172B3A"/>
                 <w:sz w:val="17"/>
               </w:rPr>
-              <w:t>Official documentation [S09–S15]</w:t>
+              <w:t>Official documentation [S09–S15, S28–S30]</w:t>
             </w:r>
           </w:p>
         </w:tc>
@@ -819,7 +849,7 @@
                 <w:color w:val="172B3A"/>
                 <w:sz w:val="17"/>
               </w:rPr>
-              <w:t>Users struggle to identify the latest version</w:t>
+              <w:t>Two interviewees reported wrong-version incidents</w:t>
             </w:r>
           </w:p>
         </w:tc>
@@ -851,7 +881,7 @@
                 <w:color w:val="172B3A"/>
                 <w:sz w:val="17"/>
               </w:rPr>
-              <w:t>Untested local hypothesis</w:t>
+              <w:t>Interview notes I01 and I07, reported by Dias Saqyp, October 2026</w:t>
             </w:r>
           </w:p>
         </w:tc>
@@ -883,7 +913,7 @@
                 <w:color w:val="172B3A"/>
                 <w:sz w:val="17"/>
               </w:rPr>
-              <w:t>Ask for a recent concrete example</w:t>
+              <w:t>Preserve fixed version binding; test recognition of the current approved version</w:t>
             </w:r>
           </w:p>
         </w:tc>
@@ -984,7 +1014,7 @@
                 <w:color w:val="172B3A"/>
                 <w:sz w:val="17"/>
               </w:rPr>
-              <w:t>Untested scope assumption</w:t>
+              <w:t>Contradicted by I01, I04, I07 and I10</w:t>
             </w:r>
           </w:p>
         </w:tc>
@@ -1016,7 +1046,7 @@
                 <w:color w:val="172B3A"/>
                 <w:sz w:val="17"/>
               </w:rPr>
-              <w:t>Confirm route and exceptions</w:t>
+              <w:t>Keep one reviewer only as an explicit prototype limit; decide sequential-stage scope and acceptance tests with supervisor</w:t>
             </w:r>
           </w:p>
         </w:tc>
@@ -1149,7 +1179,7 @@
                 <w:color w:val="172B3A"/>
                 <w:sz w:val="17"/>
               </w:rPr>
-              <w:t>Revise pilot capacity after discussions</w:t>
+              <w:t>Pilot size still unconfirmed; do not treat interview sample as account count</w:t>
             </w:r>
           </w:p>
         </w:tc>
@@ -1282,7 +1312,7 @@
                 <w:color w:val="172B3A"/>
                 <w:sz w:val="17"/>
               </w:rPr>
-              <w:t>Measure matched tasks against baseline</w:t>
+              <w:t>Measure matched tasks; do not infer a speed gain from anecdotes</w:t>
             </w:r>
           </w:p>
         </w:tc>
@@ -1298,17 +1328,17 @@
         <w:pStyle w:val="Heading2"/>
       </w:pPr>
       <w:r>
-        <w:t>Discussion protocol</w:t>
+        <w:t>Follow-up questions and method limits</w:t>
       </w:r>
     </w:p>
     <w:p>
       <w:r>
-        <w:t>Recruit 3–5 distinct representatives, ideally two document authors, one or two reviewers and one administrator or records officer. A substantive agreement with an actual client is an alternative allowed by the checklist, but it must define the workflow and requirements in enough detail. No participant identities or findings should be invented.</w:t>
+        <w:t>The ten reported conversations cover different roles and organisations. The five selected here are I01, I03, I04, I07 and I10. The other five concern project contracting, sales, HR, branch delivery and tenders; they add context but do not expand the initial product boundary to external signing, courier originals or specialist platforms. The purposive Astana sample is not representative, and examples of elapsed days or hours are anecdotes rather than measured averages.</w:t>
       </w:r>
     </w:p>
     <w:p>
       <w:r>
-        <w:t>Explain the student project, request voluntary participation and permission for notes, and use participant codes instead of names in the repository. Do not collect confidential documents. Each discussion should last approximately 20–30 minutes and use an anonymised example supplied with permission or a synthetic example.</w:t>
+        <w:t>The questions below are proposed prompts for follow-up and prototype validation. They are not presented as the exact questions used in the completed conversations. Keep identifiable raw notes outside the public repository, use participant codes and seek permission before collecting any actual documents.</w:t>
       </w:r>
     </w:p>
     <w:p>
@@ -1369,12 +1399,12 @@
     </w:p>
     <w:p>
       <w:r>
-        <w:t>Record participant code, role, date, consent, process description, anonymised supporting example, observation or short quotation, confidence and candidate requirement IDs. Separate what the participant said from the team's interpretation. Compare accounts across roles and record contradictions. Promote a hypothesis to a confirmed requirement only after its evidence reference and acceptance criterion are recorded. A single person's preference does not establish organisation-wide policy.</w:t>
+        <w:t>The supplied notes support version integrity (I01, I07), visible handoffs and decision history (I01, I03, I10), required approval stages (I04, I07, I10), and clearer prerequisites before finance review (I07, I10). Current FR05–FR08 cover fixed versions and one review cycle, but FR06 and FR07 specify only a single-reviewer slice. This does not cover the sequential routes reported by several participants. CR01 is a candidate multi-stage route requiring an agreed policy, acceptance scenario, architecture and tests; the current prototype does not satisfy it. No individual account establishes an organisation-wide rule.</w:t>
       </w:r>
     </w:p>
     <w:p>
       <w:r>
-        <w:t>The prepared interview form, blank evidence log and decision register are in management/. Their empty status is intentional. After collection, amend FR priorities, architecture and prototype, then request supervisor review. Raw identifiable notes remain outside the public repository.</w:t>
+        <w:t>An anonymised summary is now included in this report. The prepared blank interview form and evidence register in management/ remain tools for follow-up; their existence does not replace or invalidate the reported conversations. The interviewer identity and dates are recorded, but participants and companies are withheld. Ask participants to check summaries if feasible, then seek supervisor review of the proposed route and requirement changes. Do not publish raw identifiable notes.</w:t>
       </w:r>
     </w:p>
     <w:p>
@@ -1400,7 +1430,7 @@
     </w:p>
     <w:p>
       <w:r>
-        <w:t>The scientific core contains eight publications. Six date from 2022–2024 and fall within the preceding five years. Two foundational papers from 1996 and 1998 explain RBAC and explicit workflow reasoning. Technical documentation supports implementation decisions but does not count toward the eight scientific publications. The complete register contains 25 meaningfully used sources.</w:t>
+        <w:t>The scientific core contains ten publications. Eight date from 2022–2025 and fall within the preceding five years. Two foundational papers from 1996 and 1998 explain RBAC and explicit workflow reasoning. Technical documentation supports implementation decisions but does not count toward the ten scientific publications. The complete register contains 30 meaningfully used sources.</w:t>
       </w:r>
     </w:p>
     <w:p>
@@ -2627,6 +2657,272 @@
           </w:p>
         </w:tc>
       </w:tr>
+      <w:tr>
+        <w:trPr>
+          <w:cantSplit/>
+        </w:trPr>
+        <w:tc>
+          <w:tcPr>
+            <w:tcW w:type="dxa" w:w="1628"/>
+            <w:vAlign w:val="center"/>
+            <w:tcBorders>
+              <w:top w:val="single" w:sz="4" w:color="D9D9D9"/>
+              <w:left w:val="single" w:sz="4" w:color="D9D9D9"/>
+              <w:bottom w:val="single" w:sz="4" w:color="D9D9D9"/>
+              <w:right w:val="single" w:sz="4" w:color="D9D9D9"/>
+            </w:tcBorders>
+            <w:tcMar>
+              <w:top w:w="85" w:type="dxa"/>
+              <w:bottom w:w="85" w:type="dxa"/>
+              <w:left w:w="85" w:type="dxa"/>
+              <w:right w:w="85" w:type="dxa"/>
+            </w:tcMar>
+            <w:shd w:fill="FFFFFF"/>
+          </w:tcPr>
+          <w:p>
+            <w:pPr>
+              <w:spacing w:after="60" w:line="252" w:lineRule="auto"/>
+            </w:pPr>
+            <w:r>
+              <w:rPr>
+                <w:b w:val="0"/>
+                <w:color w:val="172B3A"/>
+                <w:sz w:val="17"/>
+              </w:rPr>
+              <w:t>S26 2025</w:t>
+            </w:r>
+          </w:p>
+        </w:tc>
+        <w:tc>
+          <w:tcPr>
+            <w:tcW w:type="dxa" w:w="2586"/>
+            <w:vAlign w:val="center"/>
+            <w:tcBorders>
+              <w:top w:val="single" w:sz="4" w:color="D9D9D9"/>
+              <w:left w:val="single" w:sz="4" w:color="D9D9D9"/>
+              <w:bottom w:val="single" w:sz="4" w:color="D9D9D9"/>
+              <w:right w:val="single" w:sz="4" w:color="D9D9D9"/>
+            </w:tcBorders>
+            <w:tcMar>
+              <w:top w:w="85" w:type="dxa"/>
+              <w:bottom w:w="85" w:type="dxa"/>
+              <w:left w:w="85" w:type="dxa"/>
+              <w:right w:w="85" w:type="dxa"/>
+            </w:tcMar>
+            <w:shd w:fill="FFFFFF"/>
+          </w:tcPr>
+          <w:p>
+            <w:pPr>
+              <w:spacing w:after="60" w:line="252" w:lineRule="auto"/>
+            </w:pPr>
+            <w:r>
+              <w:rPr>
+                <w:b w:val="0"/>
+                <w:color w:val="172B3A"/>
+                <w:sz w:val="17"/>
+              </w:rPr>
+              <w:t>Cross-sectional survey of 998 public-sector DMS workers. Publisher abstract and citation record.</w:t>
+            </w:r>
+          </w:p>
+        </w:tc>
+        <w:tc>
+          <w:tcPr>
+            <w:tcW w:type="dxa" w:w="2969"/>
+            <w:vAlign w:val="center"/>
+            <w:tcBorders>
+              <w:top w:val="single" w:sz="4" w:color="D9D9D9"/>
+              <w:left w:val="single" w:sz="4" w:color="D9D9D9"/>
+              <w:bottom w:val="single" w:sz="4" w:color="D9D9D9"/>
+              <w:right w:val="single" w:sz="4" w:color="D9D9D9"/>
+            </w:tcBorders>
+            <w:tcMar>
+              <w:top w:w="85" w:type="dxa"/>
+              <w:bottom w:w="85" w:type="dxa"/>
+              <w:left w:w="85" w:type="dxa"/>
+              <w:right w:w="85" w:type="dxa"/>
+            </w:tcMar>
+            <w:shd w:fill="FFFFFF"/>
+          </w:tcPr>
+          <w:p>
+            <w:pPr>
+              <w:spacing w:after="60" w:line="252" w:lineRule="auto"/>
+            </w:pPr>
+            <w:r>
+              <w:rPr>
+                <w:b w:val="0"/>
+                <w:color w:val="172B3A"/>
+                <w:sz w:val="17"/>
+              </w:rPr>
+              <w:t>Performance expectancy, effort expectancy and social influence correlate with intention to use a DMS. Non-probability sampling and correlational design do not show causation or needs in this project.</w:t>
+            </w:r>
+          </w:p>
+        </w:tc>
+        <w:tc>
+          <w:tcPr>
+            <w:tcW w:type="dxa" w:w="2394"/>
+            <w:vAlign w:val="center"/>
+            <w:tcBorders>
+              <w:top w:val="single" w:sz="4" w:color="D9D9D9"/>
+              <w:left w:val="single" w:sz="4" w:color="D9D9D9"/>
+              <w:bottom w:val="single" w:sz="4" w:color="D9D9D9"/>
+              <w:right w:val="single" w:sz="4" w:color="D9D9D9"/>
+            </w:tcBorders>
+            <w:tcMar>
+              <w:top w:w="85" w:type="dxa"/>
+              <w:bottom w:w="85" w:type="dxa"/>
+              <w:left w:w="85" w:type="dxa"/>
+              <w:right w:w="85" w:type="dxa"/>
+            </w:tcMar>
+            <w:shd w:fill="FFFFFF"/>
+          </w:tcPr>
+          <w:p>
+            <w:pPr>
+              <w:spacing w:after="60" w:line="252" w:lineRule="auto"/>
+            </w:pPr>
+            <w:r>
+              <w:rPr>
+                <w:b w:val="0"/>
+                <w:color w:val="172B3A"/>
+                <w:sz w:val="17"/>
+              </w:rPr>
+              <w:t>Include perceived ease of use, onboarding and role clarity in prototype feedback; do not promise an adoption rate.</w:t>
+            </w:r>
+          </w:p>
+        </w:tc>
+      </w:tr>
+      <w:tr>
+        <w:trPr>
+          <w:cantSplit/>
+        </w:trPr>
+        <w:tc>
+          <w:tcPr>
+            <w:tcW w:type="dxa" w:w="1628"/>
+            <w:vAlign w:val="center"/>
+            <w:tcBorders>
+              <w:top w:val="single" w:sz="4" w:color="D9D9D9"/>
+              <w:left w:val="single" w:sz="4" w:color="D9D9D9"/>
+              <w:bottom w:val="single" w:sz="4" w:color="D9D9D9"/>
+              <w:right w:val="single" w:sz="4" w:color="D9D9D9"/>
+            </w:tcBorders>
+            <w:tcMar>
+              <w:top w:w="85" w:type="dxa"/>
+              <w:bottom w:w="85" w:type="dxa"/>
+              <w:left w:w="85" w:type="dxa"/>
+              <w:right w:w="85" w:type="dxa"/>
+            </w:tcMar>
+            <w:shd w:fill="F1F5F7"/>
+          </w:tcPr>
+          <w:p>
+            <w:pPr>
+              <w:spacing w:after="60" w:line="252" w:lineRule="auto"/>
+            </w:pPr>
+            <w:r>
+              <w:rPr>
+                <w:b w:val="0"/>
+                <w:color w:val="172B3A"/>
+                <w:sz w:val="17"/>
+              </w:rPr>
+              <w:t>S27 2024</w:t>
+            </w:r>
+          </w:p>
+        </w:tc>
+        <w:tc>
+          <w:tcPr>
+            <w:tcW w:type="dxa" w:w="2586"/>
+            <w:vAlign w:val="center"/>
+            <w:tcBorders>
+              <w:top w:val="single" w:sz="4" w:color="D9D9D9"/>
+              <w:left w:val="single" w:sz="4" w:color="D9D9D9"/>
+              <w:bottom w:val="single" w:sz="4" w:color="D9D9D9"/>
+              <w:right w:val="single" w:sz="4" w:color="D9D9D9"/>
+            </w:tcBorders>
+            <w:tcMar>
+              <w:top w:w="85" w:type="dxa"/>
+              <w:bottom w:w="85" w:type="dxa"/>
+              <w:left w:w="85" w:type="dxa"/>
+              <w:right w:w="85" w:type="dxa"/>
+            </w:tcMar>
+            <w:shd w:fill="F1F5F7"/>
+          </w:tcPr>
+          <w:p>
+            <w:pPr>
+              <w:spacing w:after="60" w:line="252" w:lineRule="auto"/>
+            </w:pPr>
+            <w:r>
+              <w:rPr>
+                <w:b w:val="0"/>
+                <w:color w:val="172B3A"/>
+                <w:sz w:val="17"/>
+              </w:rPr>
+              <w:t>Theoretical investigation of archive digitisation and EDMS in Kazakhstan. Publisher abstract and citation record.</w:t>
+            </w:r>
+          </w:p>
+        </w:tc>
+        <w:tc>
+          <w:tcPr>
+            <w:tcW w:type="dxa" w:w="2969"/>
+            <w:vAlign w:val="center"/>
+            <w:tcBorders>
+              <w:top w:val="single" w:sz="4" w:color="D9D9D9"/>
+              <w:left w:val="single" w:sz="4" w:color="D9D9D9"/>
+              <w:bottom w:val="single" w:sz="4" w:color="D9D9D9"/>
+              <w:right w:val="single" w:sz="4" w:color="D9D9D9"/>
+            </w:tcBorders>
+            <w:tcMar>
+              <w:top w:w="85" w:type="dxa"/>
+              <w:bottom w:w="85" w:type="dxa"/>
+              <w:left w:w="85" w:type="dxa"/>
+              <w:right w:w="85" w:type="dxa"/>
+            </w:tcMar>
+            <w:shd w:fill="F1F5F7"/>
+          </w:tcPr>
+          <w:p>
+            <w:pPr>
+              <w:spacing w:after="60" w:line="252" w:lineRule="auto"/>
+            </w:pPr>
+            <w:r>
+              <w:rPr>
+                <w:b w:val="0"/>
+                <w:color w:val="172B3A"/>
+                <w:sz w:val="17"/>
+              </w:rPr>
+              <w:t>Describes national archival and document-management context. Its state-archive focus does not establish departmental approval requirements or current legal compliance.</w:t>
+            </w:r>
+          </w:p>
+        </w:tc>
+        <w:tc>
+          <w:tcPr>
+            <w:tcW w:type="dxa" w:w="2394"/>
+            <w:vAlign w:val="center"/>
+            <w:tcBorders>
+              <w:top w:val="single" w:sz="4" w:color="D9D9D9"/>
+              <w:left w:val="single" w:sz="4" w:color="D9D9D9"/>
+              <w:bottom w:val="single" w:sz="4" w:color="D9D9D9"/>
+              <w:right w:val="single" w:sz="4" w:color="D9D9D9"/>
+            </w:tcBorders>
+            <w:tcMar>
+              <w:top w:w="85" w:type="dxa"/>
+              <w:bottom w:w="85" w:type="dxa"/>
+              <w:left w:w="85" w:type="dxa"/>
+              <w:right w:w="85" w:type="dxa"/>
+            </w:tcMar>
+            <w:shd w:fill="F1F5F7"/>
+          </w:tcPr>
+          <w:p>
+            <w:pPr>
+              <w:spacing w:after="60" w:line="252" w:lineRule="auto"/>
+            </w:pPr>
+            <w:r>
+              <w:rPr>
+                <w:b w:val="0"/>
+                <w:color w:val="172B3A"/>
+                <w:sz w:val="17"/>
+              </w:rPr>
+              <w:t>Check local terminology, archival expectations and scope with pilot users and the supervisor.</w:t>
+            </w:r>
+          </w:p>
+        </w:tc>
+      </w:tr>
     </w:tbl>
     <w:p>
       <w:pPr>
@@ -2643,7 +2939,13 @@
     </w:p>
     <w:p>
       <w:r>
-        <w:t>EDMS reviews [S01, S02] support treating adoption and staff capability as part of the problem. They do not establish a local frequency of lost documents or a numerical efficiency gain. Accordingly, we retain usability and onboarding requirements and leave local relevance open until discussions occur.</w:t>
+        <w:t>EDMS reviews [S01, S02] and the DMS adoption survey [S26] support treating adoption, ease of use and staff capability as part of the problem. The survey reports associations rather than causal effects and does not establish an adoption rate for this project. The reported Astana conversations provide examples of version, status and approval-history problems; benefits and usability of the proposed system still require evaluation.</w:t>
+      </w:r>
+    </w:p>
+    <w:p>
+      <w:pPr/>
+      <w:r>
+        <w:t>The Kazakhstan archive study [S27] provides local documentary context, but it concerns state archives and relies on theoretical investigation. It does not define the policy of a departmental approval workflow or establish legal compliance. Confirm terminology, archival expectations and scope with the intended pilot users and supervisor.</w:t>
       </w:r>
     </w:p>
     <w:p>
@@ -2684,7 +2986,7 @@
     </w:p>
     <w:p>
       <w:r>
-        <w:t>Four relevant systems cover hosted collaboration, self-hosted file collaboration and dedicated document management: SharePoint with Power Automate, Nextcloud with Flow, Mayan EDMS and Paperless-ngx. The same eight criteria apply to all. Documentation was checked on 19 October 2026. This is a documentation review, not a hands-on benchmark, security audit or price quotation.</w:t>
+        <w:t>Five relevant system families cover hosted collaboration, self-hosted file collaboration, dedicated document management and a Kazakhstan-market enterprise offering: SharePoint with Power Automate, Nextcloud with Flow, Mayan EDMS, Paperless-ngx and Documentolog Platform / d8n.ai Enterprise. The same eight criteria apply to all. Documentation for the first four was checked on 19 October 2026; Kazakhstan sources were checked on 23 October 2026. This is a documentation review, not a hands-on benchmark, security audit or price quotation. The vendor reports migration of existing Documentolog Platform clients to d8n.ai [S30]. Current feature claims use the d8n.ai internal-document solution [S28] and local product identity uses the Kazakhstan register [S29]; equivalence between generations is not assumed. Documentolog Business and Doculite are separate offerings.</w:t>
       </w:r>
     </w:p>
     <w:p>
@@ -4203,22 +4505,641 @@
         <w:pStyle w:val="Heading2"/>
       </w:pPr>
       <w:r>
+        <w:t>Kazakhstan-market system on the same eight criteria</w:t>
+      </w:r>
+    </w:p>
+    <w:tbl>
+      <w:tblPr>
+        <w:tblStyle w:val="TableGrid"/>
+        <w:tblW w:type="auto" w:w="0"/>
+        <w:jc w:val="center"/>
+        <w:tblLayout w:type="fixed"/>
+        <w:tblLook w:firstColumn="1" w:firstRow="1" w:lastColumn="0" w:lastRow="0" w:noHBand="0" w:noVBand="1" w:val="04A0"/>
+      </w:tblPr>
+      <w:tblGrid>
+        <w:gridCol w:w="2952"/>
+        <w:gridCol w:w="6624"/>
+      </w:tblGrid>
+      <w:tr>
+        <w:tc>
+          <w:tcPr>
+            <w:tcW w:type="dxa" w:w="2952"/>
+            <w:vAlign w:val="center"/>
+            <w:shd w:fill="203F52"/>
+            <w:tcMar>
+              <w:top w:w="95" w:type="dxa"/>
+              <w:bottom w:w="95" w:type="dxa"/>
+              <w:left w:w="105" w:type="dxa"/>
+              <w:right w:w="105" w:type="dxa"/>
+            </w:tcMar>
+            <w:tcBorders>
+              <w:top w:val="single" w:sz="4" w:color="D5DDE1"/>
+              <w:bottom w:val="single" w:sz="4" w:color="D5DDE1"/>
+              <w:left w:val="single" w:sz="4" w:color="D5DDE1"/>
+              <w:right w:val="single" w:sz="4" w:color="D5DDE1"/>
+            </w:tcBorders>
+          </w:tcPr>
+          <w:p>
+            <w:pPr>
+              <w:spacing w:before="0" w:after="0" w:line="240" w:lineRule="auto"/>
+              <w:jc w:val="left"/>
+            </w:pPr>
+            <w:r>
+              <w:rPr>
+                <w:rFonts w:ascii="Calibri" w:hAnsi="Calibri"/>
+                <w:b/>
+                <w:color w:val="FFFFFF"/>
+                <w:sz w:val="17"/>
+              </w:rPr>
+              <w:t>Criterion</w:t>
+            </w:r>
+          </w:p>
+        </w:tc>
+        <w:tc>
+          <w:tcPr>
+            <w:tcW w:type="dxa" w:w="6624"/>
+            <w:vAlign w:val="center"/>
+            <w:shd w:fill="203F52"/>
+            <w:tcMar>
+              <w:top w:w="95" w:type="dxa"/>
+              <w:bottom w:w="95" w:type="dxa"/>
+              <w:left w:w="105" w:type="dxa"/>
+              <w:right w:w="105" w:type="dxa"/>
+            </w:tcMar>
+            <w:tcBorders>
+              <w:top w:val="single" w:sz="4" w:color="D5DDE1"/>
+              <w:bottom w:val="single" w:sz="4" w:color="D5DDE1"/>
+              <w:left w:val="single" w:sz="4" w:color="D5DDE1"/>
+              <w:right w:val="single" w:sz="4" w:color="D5DDE1"/>
+            </w:tcBorders>
+          </w:tcPr>
+          <w:p>
+            <w:pPr>
+              <w:spacing w:before="0" w:after="0" w:line="240" w:lineRule="auto"/>
+              <w:jc w:val="left"/>
+            </w:pPr>
+            <w:r>
+              <w:rPr>
+                <w:rFonts w:ascii="Calibri" w:hAnsi="Calibri"/>
+                <w:b/>
+                <w:color w:val="FFFFFF"/>
+                <w:sz w:val="17"/>
+              </w:rPr>
+              <w:t>Documentolog Platform / d8n.ai Enterprise</w:t>
+            </w:r>
+          </w:p>
+        </w:tc>
+      </w:tr>
+      <w:tr>
+        <w:tc>
+          <w:tcPr>
+            <w:tcW w:type="dxa" w:w="2952"/>
+            <w:vAlign w:val="center"/>
+            <w:shd w:fill="FFFFFF"/>
+            <w:tcMar>
+              <w:top w:w="95" w:type="dxa"/>
+              <w:bottom w:w="95" w:type="dxa"/>
+              <w:left w:w="105" w:type="dxa"/>
+              <w:right w:w="105" w:type="dxa"/>
+            </w:tcMar>
+            <w:tcBorders>
+              <w:top w:val="single" w:sz="4" w:color="D5DDE1"/>
+              <w:bottom w:val="single" w:sz="4" w:color="D5DDE1"/>
+              <w:left w:val="single" w:sz="4" w:color="D5DDE1"/>
+              <w:right w:val="single" w:sz="4" w:color="D5DDE1"/>
+            </w:tcBorders>
+          </w:tcPr>
+          <w:p>
+            <w:pPr>
+              <w:spacing w:before="0" w:after="0" w:line="240" w:lineRule="auto"/>
+              <w:jc w:val="left"/>
+            </w:pPr>
+            <w:r>
+              <w:rPr>
+                <w:rFonts w:ascii="Calibri" w:hAnsi="Calibri"/>
+                <w:sz w:val="17"/>
+              </w:rPr>
+              <w:t>Document lifecycle automation</w:t>
+            </w:r>
+          </w:p>
+        </w:tc>
+        <w:tc>
+          <w:tcPr>
+            <w:tcW w:type="dxa" w:w="6624"/>
+            <w:vAlign w:val="center"/>
+            <w:shd w:fill="FFFFFF"/>
+            <w:tcMar>
+              <w:top w:w="95" w:type="dxa"/>
+              <w:bottom w:w="95" w:type="dxa"/>
+              <w:left w:w="105" w:type="dxa"/>
+              <w:right w:w="105" w:type="dxa"/>
+            </w:tcMar>
+            <w:tcBorders>
+              <w:top w:val="single" w:sz="4" w:color="D5DDE1"/>
+              <w:bottom w:val="single" w:sz="4" w:color="D5DDE1"/>
+              <w:left w:val="single" w:sz="4" w:color="D5DDE1"/>
+              <w:right w:val="single" w:sz="4" w:color="D5DDE1"/>
+            </w:tcBorders>
+          </w:tcPr>
+          <w:p>
+            <w:pPr>
+              <w:spacing w:before="0" w:after="0" w:line="240" w:lineRule="auto"/>
+              <w:jc w:val="left"/>
+            </w:pPr>
+            <w:r>
+              <w:rPr>
+                <w:rFonts w:ascii="Calibri" w:hAnsi="Calibri"/>
+                <w:sz w:val="17"/>
+              </w:rPr>
+              <w:t>C routed internal solution needs setup [S28, S29]</w:t>
+            </w:r>
+          </w:p>
+        </w:tc>
+      </w:tr>
+      <w:tr>
+        <w:tc>
+          <w:tcPr>
+            <w:tcW w:type="dxa" w:w="2952"/>
+            <w:vAlign w:val="center"/>
+            <w:shd w:fill="EEF2F4"/>
+            <w:tcMar>
+              <w:top w:w="95" w:type="dxa"/>
+              <w:bottom w:w="95" w:type="dxa"/>
+              <w:left w:w="105" w:type="dxa"/>
+              <w:right w:w="105" w:type="dxa"/>
+            </w:tcMar>
+            <w:tcBorders>
+              <w:top w:val="single" w:sz="4" w:color="D5DDE1"/>
+              <w:bottom w:val="single" w:sz="4" w:color="D5DDE1"/>
+              <w:left w:val="single" w:sz="4" w:color="D5DDE1"/>
+              <w:right w:val="single" w:sz="4" w:color="D5DDE1"/>
+            </w:tcBorders>
+          </w:tcPr>
+          <w:p>
+            <w:pPr>
+              <w:spacing w:before="0" w:after="0" w:line="240" w:lineRule="auto"/>
+              <w:jc w:val="left"/>
+            </w:pPr>
+            <w:r>
+              <w:rPr>
+                <w:rFonts w:ascii="Calibri" w:hAnsi="Calibri"/>
+                <w:sz w:val="17"/>
+              </w:rPr>
+              <w:t>Human approval pinned to version</w:t>
+            </w:r>
+          </w:p>
+        </w:tc>
+        <w:tc>
+          <w:tcPr>
+            <w:tcW w:type="dxa" w:w="6624"/>
+            <w:vAlign w:val="center"/>
+            <w:shd w:fill="EEF2F4"/>
+            <w:tcMar>
+              <w:top w:w="95" w:type="dxa"/>
+              <w:bottom w:w="95" w:type="dxa"/>
+              <w:left w:w="105" w:type="dxa"/>
+              <w:right w:w="105" w:type="dxa"/>
+            </w:tcMar>
+            <w:tcBorders>
+              <w:top w:val="single" w:sz="4" w:color="D5DDE1"/>
+              <w:bottom w:val="single" w:sz="4" w:color="D5DDE1"/>
+              <w:left w:val="single" w:sz="4" w:color="D5DDE1"/>
+              <w:right w:val="single" w:sz="4" w:color="D5DDE1"/>
+            </w:tcBorders>
+          </w:tcPr>
+          <w:p>
+            <w:pPr>
+              <w:spacing w:before="0" w:after="0" w:line="240" w:lineRule="auto"/>
+              <w:jc w:val="left"/>
+            </w:pPr>
+            <w:r>
+              <w:rPr>
+                <w:rFonts w:ascii="Calibri" w:hAnsi="Calibri"/>
+                <w:sz w:val="17"/>
+              </w:rPr>
+              <w:t>U exact version binding [S28]</w:t>
+            </w:r>
+          </w:p>
+        </w:tc>
+      </w:tr>
+      <w:tr>
+        <w:tc>
+          <w:tcPr>
+            <w:tcW w:type="dxa" w:w="2952"/>
+            <w:vAlign w:val="center"/>
+            <w:shd w:fill="FFFFFF"/>
+            <w:tcMar>
+              <w:top w:w="95" w:type="dxa"/>
+              <w:bottom w:w="95" w:type="dxa"/>
+              <w:left w:w="105" w:type="dxa"/>
+              <w:right w:w="105" w:type="dxa"/>
+            </w:tcMar>
+            <w:tcBorders>
+              <w:top w:val="single" w:sz="4" w:color="D5DDE1"/>
+              <w:bottom w:val="single" w:sz="4" w:color="D5DDE1"/>
+              <w:left w:val="single" w:sz="4" w:color="D5DDE1"/>
+              <w:right w:val="single" w:sz="4" w:color="D5DDE1"/>
+            </w:tcBorders>
+          </w:tcPr>
+          <w:p>
+            <w:pPr>
+              <w:spacing w:before="0" w:after="0" w:line="240" w:lineRule="auto"/>
+              <w:jc w:val="left"/>
+            </w:pPr>
+            <w:r>
+              <w:rPr>
+                <w:rFonts w:ascii="Calibri" w:hAnsi="Calibri"/>
+                <w:sz w:val="17"/>
+              </w:rPr>
+              <w:t>Version history</w:t>
+            </w:r>
+          </w:p>
+        </w:tc>
+        <w:tc>
+          <w:tcPr>
+            <w:tcW w:type="dxa" w:w="6624"/>
+            <w:vAlign w:val="center"/>
+            <w:shd w:fill="FFFFFF"/>
+            <w:tcMar>
+              <w:top w:w="95" w:type="dxa"/>
+              <w:bottom w:w="95" w:type="dxa"/>
+              <w:left w:w="105" w:type="dxa"/>
+              <w:right w:w="105" w:type="dxa"/>
+            </w:tcMar>
+            <w:tcBorders>
+              <w:top w:val="single" w:sz="4" w:color="D5DDE1"/>
+              <w:bottom w:val="single" w:sz="4" w:color="D5DDE1"/>
+              <w:left w:val="single" w:sz="4" w:color="D5DDE1"/>
+              <w:right w:val="single" w:sz="4" w:color="D5DDE1"/>
+            </w:tcBorders>
+          </w:tcPr>
+          <w:p>
+            <w:pPr>
+              <w:spacing w:before="0" w:after="0" w:line="240" w:lineRule="auto"/>
+              <w:jc w:val="left"/>
+            </w:pPr>
+            <w:r>
+              <w:rPr>
+                <w:rFonts w:ascii="Calibri" w:hAnsi="Calibri"/>
+                <w:sz w:val="17"/>
+              </w:rPr>
+              <w:t>D version history and control [S28]</w:t>
+            </w:r>
+          </w:p>
+        </w:tc>
+      </w:tr>
+      <w:tr>
+        <w:tc>
+          <w:tcPr>
+            <w:tcW w:type="dxa" w:w="2952"/>
+            <w:vAlign w:val="center"/>
+            <w:shd w:fill="EEF2F4"/>
+            <w:tcMar>
+              <w:top w:w="95" w:type="dxa"/>
+              <w:bottom w:w="95" w:type="dxa"/>
+              <w:left w:w="105" w:type="dxa"/>
+              <w:right w:w="105" w:type="dxa"/>
+            </w:tcMar>
+            <w:tcBorders>
+              <w:top w:val="single" w:sz="4" w:color="D5DDE1"/>
+              <w:bottom w:val="single" w:sz="4" w:color="D5DDE1"/>
+              <w:left w:val="single" w:sz="4" w:color="D5DDE1"/>
+              <w:right w:val="single" w:sz="4" w:color="D5DDE1"/>
+            </w:tcBorders>
+          </w:tcPr>
+          <w:p>
+            <w:pPr>
+              <w:spacing w:before="0" w:after="0" w:line="240" w:lineRule="auto"/>
+              <w:jc w:val="left"/>
+            </w:pPr>
+            <w:r>
+              <w:rPr>
+                <w:rFonts w:ascii="Calibri" w:hAnsi="Calibri"/>
+                <w:sz w:val="17"/>
+              </w:rPr>
+              <w:t>Access control</w:t>
+            </w:r>
+          </w:p>
+        </w:tc>
+        <w:tc>
+          <w:tcPr>
+            <w:tcW w:type="dxa" w:w="6624"/>
+            <w:vAlign w:val="center"/>
+            <w:shd w:fill="EEF2F4"/>
+            <w:tcMar>
+              <w:top w:w="95" w:type="dxa"/>
+              <w:bottom w:w="95" w:type="dxa"/>
+              <w:left w:w="105" w:type="dxa"/>
+              <w:right w:w="105" w:type="dxa"/>
+            </w:tcMar>
+            <w:tcBorders>
+              <w:top w:val="single" w:sz="4" w:color="D5DDE1"/>
+              <w:bottom w:val="single" w:sz="4" w:color="D5DDE1"/>
+              <w:left w:val="single" w:sz="4" w:color="D5DDE1"/>
+              <w:right w:val="single" w:sz="4" w:color="D5DDE1"/>
+            </w:tcBorders>
+          </w:tcPr>
+          <w:p>
+            <w:pPr>
+              <w:spacing w:before="0" w:after="0" w:line="240" w:lineRule="auto"/>
+              <w:jc w:val="left"/>
+            </w:pPr>
+            <w:r>
+              <w:rPr>
+                <w:rFonts w:ascii="Calibri" w:hAnsi="Calibri"/>
+                <w:sz w:val="17"/>
+              </w:rPr>
+              <w:t>D managed rights; granularity U [S28]</w:t>
+            </w:r>
+          </w:p>
+        </w:tc>
+      </w:tr>
+      <w:tr>
+        <w:tc>
+          <w:tcPr>
+            <w:tcW w:type="dxa" w:w="2952"/>
+            <w:vAlign w:val="center"/>
+            <w:shd w:fill="FFFFFF"/>
+            <w:tcMar>
+              <w:top w:w="95" w:type="dxa"/>
+              <w:bottom w:w="95" w:type="dxa"/>
+              <w:left w:w="105" w:type="dxa"/>
+              <w:right w:w="105" w:type="dxa"/>
+            </w:tcMar>
+            <w:tcBorders>
+              <w:top w:val="single" w:sz="4" w:color="D5DDE1"/>
+              <w:bottom w:val="single" w:sz="4" w:color="D5DDE1"/>
+              <w:left w:val="single" w:sz="4" w:color="D5DDE1"/>
+              <w:right w:val="single" w:sz="4" w:color="D5DDE1"/>
+            </w:tcBorders>
+          </w:tcPr>
+          <w:p>
+            <w:pPr>
+              <w:spacing w:before="0" w:after="0" w:line="240" w:lineRule="auto"/>
+              <w:jc w:val="left"/>
+            </w:pPr>
+            <w:r>
+              <w:rPr>
+                <w:rFonts w:ascii="Calibri" w:hAnsi="Calibri"/>
+                <w:sz w:val="17"/>
+              </w:rPr>
+              <w:t>Metadata organisation</w:t>
+            </w:r>
+          </w:p>
+        </w:tc>
+        <w:tc>
+          <w:tcPr>
+            <w:tcW w:type="dxa" w:w="6624"/>
+            <w:vAlign w:val="center"/>
+            <w:shd w:fill="FFFFFF"/>
+            <w:tcMar>
+              <w:top w:w="95" w:type="dxa"/>
+              <w:bottom w:w="95" w:type="dxa"/>
+              <w:left w:w="105" w:type="dxa"/>
+              <w:right w:w="105" w:type="dxa"/>
+            </w:tcMar>
+            <w:tcBorders>
+              <w:top w:val="single" w:sz="4" w:color="D5DDE1"/>
+              <w:bottom w:val="single" w:sz="4" w:color="D5DDE1"/>
+              <w:left w:val="single" w:sz="4" w:color="D5DDE1"/>
+              <w:right w:val="single" w:sz="4" w:color="D5DDE1"/>
+            </w:tcBorders>
+          </w:tcPr>
+          <w:p>
+            <w:pPr>
+              <w:spacing w:before="0" w:after="0" w:line="240" w:lineRule="auto"/>
+              <w:jc w:val="left"/>
+            </w:pPr>
+            <w:r>
+              <w:rPr>
+                <w:rFonts w:ascii="Calibri" w:hAnsi="Calibri"/>
+                <w:sz w:val="17"/>
+              </w:rPr>
+              <w:t>U metadata field scheme; registry documented [S28]</w:t>
+            </w:r>
+          </w:p>
+        </w:tc>
+      </w:tr>
+      <w:tr>
+        <w:tc>
+          <w:tcPr>
+            <w:tcW w:type="dxa" w:w="2952"/>
+            <w:vAlign w:val="center"/>
+            <w:shd w:fill="EEF2F4"/>
+            <w:tcMar>
+              <w:top w:w="95" w:type="dxa"/>
+              <w:bottom w:w="95" w:type="dxa"/>
+              <w:left w:w="105" w:type="dxa"/>
+              <w:right w:w="105" w:type="dxa"/>
+            </w:tcMar>
+            <w:tcBorders>
+              <w:top w:val="single" w:sz="4" w:color="D5DDE1"/>
+              <w:bottom w:val="single" w:sz="4" w:color="D5DDE1"/>
+              <w:left w:val="single" w:sz="4" w:color="D5DDE1"/>
+              <w:right w:val="single" w:sz="4" w:color="D5DDE1"/>
+            </w:tcBorders>
+          </w:tcPr>
+          <w:p>
+            <w:pPr>
+              <w:spacing w:before="0" w:after="0" w:line="240" w:lineRule="auto"/>
+              <w:jc w:val="left"/>
+            </w:pPr>
+            <w:r>
+              <w:rPr>
+                <w:rFonts w:ascii="Calibri" w:hAnsi="Calibri"/>
+                <w:sz w:val="17"/>
+              </w:rPr>
+              <w:t>Decision or activity evidence</w:t>
+            </w:r>
+          </w:p>
+        </w:tc>
+        <w:tc>
+          <w:tcPr>
+            <w:tcW w:type="dxa" w:w="6624"/>
+            <w:vAlign w:val="center"/>
+            <w:shd w:fill="EEF2F4"/>
+            <w:tcMar>
+              <w:top w:w="95" w:type="dxa"/>
+              <w:bottom w:w="95" w:type="dxa"/>
+              <w:left w:w="105" w:type="dxa"/>
+              <w:right w:w="105" w:type="dxa"/>
+            </w:tcMar>
+            <w:tcBorders>
+              <w:top w:val="single" w:sz="4" w:color="D5DDE1"/>
+              <w:bottom w:val="single" w:sz="4" w:color="D5DDE1"/>
+              <w:left w:val="single" w:sz="4" w:color="D5DDE1"/>
+              <w:right w:val="single" w:sz="4" w:color="D5DDE1"/>
+            </w:tcBorders>
+          </w:tcPr>
+          <w:p>
+            <w:pPr>
+              <w:spacing w:before="0" w:after="0" w:line="240" w:lineRule="auto"/>
+              <w:jc w:val="left"/>
+            </w:pPr>
+            <w:r>
+              <w:rPr>
+                <w:rFonts w:ascii="Calibri" w:hAnsi="Calibri"/>
+                <w:sz w:val="17"/>
+              </w:rPr>
+              <w:t>D action history claimed; exact scope U [S28]</w:t>
+            </w:r>
+          </w:p>
+        </w:tc>
+      </w:tr>
+      <w:tr>
+        <w:tc>
+          <w:tcPr>
+            <w:tcW w:type="dxa" w:w="2952"/>
+            <w:vAlign w:val="center"/>
+            <w:shd w:fill="FFFFFF"/>
+            <w:tcMar>
+              <w:top w:w="95" w:type="dxa"/>
+              <w:bottom w:w="95" w:type="dxa"/>
+              <w:left w:w="105" w:type="dxa"/>
+              <w:right w:w="105" w:type="dxa"/>
+            </w:tcMar>
+            <w:tcBorders>
+              <w:top w:val="single" w:sz="4" w:color="D5DDE1"/>
+              <w:bottom w:val="single" w:sz="4" w:color="D5DDE1"/>
+              <w:left w:val="single" w:sz="4" w:color="D5DDE1"/>
+              <w:right w:val="single" w:sz="4" w:color="D5DDE1"/>
+            </w:tcBorders>
+          </w:tcPr>
+          <w:p>
+            <w:pPr>
+              <w:spacing w:before="0" w:after="0" w:line="240" w:lineRule="auto"/>
+              <w:jc w:val="left"/>
+            </w:pPr>
+            <w:r>
+              <w:rPr>
+                <w:rFonts w:ascii="Calibri" w:hAnsi="Calibri"/>
+                <w:sz w:val="17"/>
+              </w:rPr>
+              <w:t>Automation interface</w:t>
+            </w:r>
+          </w:p>
+        </w:tc>
+        <w:tc>
+          <w:tcPr>
+            <w:tcW w:type="dxa" w:w="6624"/>
+            <w:vAlign w:val="center"/>
+            <w:shd w:fill="FFFFFF"/>
+            <w:tcMar>
+              <w:top w:w="95" w:type="dxa"/>
+              <w:bottom w:w="95" w:type="dxa"/>
+              <w:left w:w="105" w:type="dxa"/>
+              <w:right w:w="105" w:type="dxa"/>
+            </w:tcMar>
+            <w:tcBorders>
+              <w:top w:val="single" w:sz="4" w:color="D5DDE1"/>
+              <w:bottom w:val="single" w:sz="4" w:color="D5DDE1"/>
+              <w:left w:val="single" w:sz="4" w:color="D5DDE1"/>
+              <w:right w:val="single" w:sz="4" w:color="D5DDE1"/>
+            </w:tcBorders>
+          </w:tcPr>
+          <w:p>
+            <w:pPr>
+              <w:spacing w:before="0" w:after="0" w:line="240" w:lineRule="auto"/>
+              <w:jc w:val="left"/>
+            </w:pPr>
+            <w:r>
+              <w:rPr>
+                <w:rFonts w:ascii="Calibri" w:hAnsi="Calibri"/>
+                <w:sz w:val="17"/>
+              </w:rPr>
+              <w:t>C external integrations; exact API U [S28, S29]</w:t>
+            </w:r>
+          </w:p>
+        </w:tc>
+      </w:tr>
+      <w:tr>
+        <w:tc>
+          <w:tcPr>
+            <w:tcW w:type="dxa" w:w="2952"/>
+            <w:vAlign w:val="center"/>
+            <w:shd w:fill="EEF2F4"/>
+            <w:tcMar>
+              <w:top w:w="95" w:type="dxa"/>
+              <w:bottom w:w="95" w:type="dxa"/>
+              <w:left w:w="105" w:type="dxa"/>
+              <w:right w:w="105" w:type="dxa"/>
+            </w:tcMar>
+            <w:tcBorders>
+              <w:top w:val="single" w:sz="4" w:color="D5DDE1"/>
+              <w:bottom w:val="single" w:sz="4" w:color="D5DDE1"/>
+              <w:left w:val="single" w:sz="4" w:color="D5DDE1"/>
+              <w:right w:val="single" w:sz="4" w:color="D5DDE1"/>
+            </w:tcBorders>
+          </w:tcPr>
+          <w:p>
+            <w:pPr>
+              <w:spacing w:before="0" w:after="0" w:line="240" w:lineRule="auto"/>
+              <w:jc w:val="left"/>
+            </w:pPr>
+            <w:r>
+              <w:rPr>
+                <w:rFonts w:ascii="Calibri" w:hAnsi="Calibri"/>
+                <w:sz w:val="17"/>
+              </w:rPr>
+              <w:t>Deployment and administration</w:t>
+            </w:r>
+          </w:p>
+        </w:tc>
+        <w:tc>
+          <w:tcPr>
+            <w:tcW w:type="dxa" w:w="6624"/>
+            <w:vAlign w:val="center"/>
+            <w:shd w:fill="EEF2F4"/>
+            <w:tcMar>
+              <w:top w:w="95" w:type="dxa"/>
+              <w:bottom w:w="95" w:type="dxa"/>
+              <w:left w:w="105" w:type="dxa"/>
+              <w:right w:w="105" w:type="dxa"/>
+            </w:tcMar>
+            <w:tcBorders>
+              <w:top w:val="single" w:sz="4" w:color="D5DDE1"/>
+              <w:bottom w:val="single" w:sz="4" w:color="D5DDE1"/>
+              <w:left w:val="single" w:sz="4" w:color="D5DDE1"/>
+              <w:right w:val="single" w:sz="4" w:color="D5DDE1"/>
+            </w:tcBorders>
+          </w:tcPr>
+          <w:p>
+            <w:pPr>
+              <w:spacing w:before="0" w:after="0" w:line="240" w:lineRule="auto"/>
+              <w:jc w:val="left"/>
+            </w:pPr>
+            <w:r>
+              <w:rPr>
+                <w:rFonts w:ascii="Calibri" w:hAnsi="Calibri"/>
+                <w:sz w:val="17"/>
+              </w:rPr>
+              <w:t>U exact hosting and administration model for this edition [S28]</w:t>
+            </w:r>
+          </w:p>
+        </w:tc>
+      </w:tr>
+    </w:tbl>
+    <w:p>
+      <w:pPr>
+        <w:pStyle w:val="Heading2"/>
+      </w:pPr>
+      <w:r>
         <w:t>Interpretation and build versus configure decision</w:t>
       </w:r>
     </w:p>
     <w:p>
       <w:r>
-        <w:t>The comparison shows substantial overlap with the proposed project. It does not justify claims that alternatives lack permissions, workflows or audit features. SharePoint provides an explicit example of version-aware approval. Mayan is a strong candidate for a configuration trial. Paperless focuses on ingestion and document organisation in the inspected workflow documentation, so equivalence to an author–reviewer lifecycle needs testing. Nextcloud's automatic version expiry requires checking against the desired record policy.</w:t>
+        <w:t>The comparison shows substantial overlap with the proposed project. It does not justify claims that alternatives lack permissions, workflows or audit features. SharePoint provides an explicit version-aware approval example. Mayan is a candidate for a configuration trial. Paperless focuses on ingestion and document organisation in the inspected workflow documentation, so equivalence to an author–reviewer lifecycle needs testing. Nextcloud version expiry requires checking against the desired record policy. Documentolog / d8n.ai is a direct Kazakhstan-market alternative with documented internal routing, versions and archive/search [S28–S30]; frozen-version approval and audit-history scope still need a hands-on check. The university and reported conversations are in Astana, but no pilot organisation has been selected.</w:t>
       </w:r>
     </w:p>
     <w:p>
       <w:r>
-        <w:t>Our provisional reason to build is educational engineering work around a narrow approval workflow with inspectable rules, a consistent user journey and an evaluation baseline. Commercial necessity is unproven. After interviews, spend one time-boxed session configuring the mandatory scenario in SharePoint or Mayan. Record route setup effort, version binding, access isolation and recovery from requested changes. If configuration satisfies the mandatory requirements with acceptable administration, recommend adaptation or narrow the custom contribution with supervisor agreement.</w:t>
+        <w:t>Our provisional reason to build is educational engineering work around a narrow approval workflow with inspectable rules, a consistent user journey and an evaluation baseline. Commercial necessity is unproven. The next checkpoint should time-box configuration of the mandatory scenario in an accessible alternative such as SharePoint, Mayan or the current d8n.ai offering. Record route setup effort, version binding, access isolation and recovery from requested changes. If configuration satisfies mandatory requirements with acceptable administration, recommend adaptation or narrow the custom contribution with supervisor agreement.</w:t>
       </w:r>
     </w:p>
     <w:p>
       <w:r>
-        <w:t>The proposed prototype illustrates a design choice; it is not a fifth production competitor and has not met production security or storage requirements. No product price, compliance certification or unsupported absence claim forms part of the comparison.</w:t>
+        <w:t>The proposed prototype illustrates a design choice; it is not a sixth production competitor and has not met production security or storage requirements. No product price, compliance certification or unsupported absence claim forms part of the comparison.</w:t>
       </w:r>
     </w:p>
     <w:p>
@@ -6773,7 +7694,7 @@
     </w:p>
     <w:p>
       <w:r>
-        <w:t>Version 0.1 is a proposed baseline awaiting user and supervisor validation. Must requirements define the mandatory later implementation, and Should requirements may be deferred with a recorded decision. Prototype coverage is stated explicitly. Neither client-side role simulation nor passing local model tests proves server security.</w:t>
+        <w:t>Version 0.2 is a proposed baseline informed by the ten Astana conversations reported by Dias Saqyp and awaits pilot-organisation and supervisor validation. Must requirements define the mandatory later implementation for the single-reviewer demonstration slice; FR06 and FR07 cover only one review stage. Candidate CR01 addresses ordered reviewers but is not implemented or committed to the current MVP. Confirm its route policy, priority and tests before adding it to the validated baseline. Should requirements may be deferred with a recorded decision. Neither client-side role simulation nor passing local model tests proves server security.</w:t>
       </w:r>
     </w:p>
     <w:p>
@@ -7821,7 +8742,7 @@
                 <w:color w:val="172B3A"/>
                 <w:sz w:val="17"/>
               </w:rPr>
-              <w:t>FR06 Must</w:t>
+              <w:t>FR06 Must, limited slice</w:t>
             </w:r>
           </w:p>
         </w:tc>
@@ -7885,7 +8806,7 @@
                 <w:color w:val="172B3A"/>
                 <w:sz w:val="17"/>
               </w:rPr>
-              <w:t>The owner assigns a different active reviewer and creates one pending review tied to the current version. Submitted content is locked.</w:t>
+              <w:t>The owner assigns a different active reviewer and creates one pending review tied to the current version. Submitted content is locked. This one-stage acceptance does not complete an observed multi-stage route.</w:t>
             </w:r>
           </w:p>
         </w:tc>
@@ -7986,7 +8907,7 @@
                 <w:color w:val="172B3A"/>
                 <w:sz w:val="17"/>
               </w:rPr>
-              <w:t>FR07 Must</w:t>
+              <w:t>FR07 Must, limited slice</w:t>
             </w:r>
           </w:p>
         </w:tc>
@@ -8050,7 +8971,7 @@
                 <w:color w:val="172B3A"/>
                 <w:sz w:val="17"/>
               </w:rPr>
-              <w:t>Only the assigned reviewer can approve or return an In review document. Return requires a nonblank reason. Duplicate decisions fail.</w:t>
+              <w:t>Only the assigned reviewer can approve or return an In review document. Return requires a nonblank reason. Duplicate decisions fail. Complete organisational approval may require further stages.</w:t>
             </w:r>
           </w:p>
         </w:tc>
@@ -11928,7 +12849,7 @@
     </w:p>
     <w:p>
       <w:r>
-        <w:t>The editable .drawio files and readable SVG and PNG exports in diagrams/ are part of this package. Context, UML use case and draft UML component diagrams correspond to the same roles and components as the requirements. A supplementary state diagram documents the permitted lifecycle.</w:t>
+        <w:t>The editable .drawio files and readable SVG and PNG exports in diagrams/ are part of this package. Six diagrams cover the system: context, UML use case, draft UML component/container, state, ER and sequence. The ER and sequence diagrams were added for EDFS-7. They are design artifacts for the later server implementation, not evidence of a deployed backend.</w:t>
       </w:r>
     </w:p>
     <w:p>
@@ -12253,7 +13174,7 @@
     </w:p>
     <w:p>
       <w:r>
-        <w:t>There is no real login, server authorization, durable shared database, binary upload validation, malware scanner, role administration, notification worker or backup. The browser owner can modify local storage and the apparent audit trail. The revision guard illustrates a stale update rule in one state model; it does not provide transactional isolation across browsers. Multiple-tab changes require a reload. Do not use real or confidential documents.</w:t>
+        <w:t>There is no real login, server authorization, durable shared database, binary upload validation, malware scanner, role administration, notification worker or backup. The route supports one assigned reviewer, whereas I01, I04, I07 and I10 describe processes with multiple review roles or missing prior decisions. The browser owner can modify local storage and the apparent audit trail. These limitations prevent a claim that the prototype is a production workflow or a tested multi-stage solution.</w:t>
       </w:r>
     </w:p>
     <w:p>
@@ -14634,7 +15555,7 @@
     </w:p>
     <w:p>
       <w:r>
-        <w:t>The primary question is whether the system helps users identify a document's state and complete a controlled approval journey with less effort. The baseline is an explicitly prepared shared folder with versioned filenames, a spreadsheet status log and message templates. This baseline is synthetic and must later be checked against the actual department's process. It does not assume that the client currently works this way.</w:t>
+        <w:t>The primary question is whether the system helps users identify a document state and complete a controlled approval journey with less effort. For a controlled paired study, prepare a shared folder, versioned filenames, a spreadsheet status register and email or messenger handoffs as the baseline. Record each recruited user's real current tools separately; I07 already uses Jira Service Desk for assignee visibility, so the prepared baseline must not be presented as universal.</w:t>
       </w:r>
     </w:p>
     <w:p>
@@ -15417,12 +16338,12 @@
     </w:p>
     <w:p>
       <w:r>
-        <w:t>The following allocation is a proposal for team confirmation. Qazybai Ali owns workflow and backend design, server policy, database consistency and integration tests. Saqyp Dias owns user discovery coordination, UX, prototype refinement, comparisons and usability study preparation. Both students review the literature, requirements and architecture. Each student must use their own identifiable account and review the other's substantial changes. Askar Khaimuldin reviews scope, requirements, architecture and evaluation at agreed checkpoints.</w:t>
+        <w:t>Dias Saqyp personally conducted the ten October 2026 user conversations, according to his confirmation. The remaining division of future work is a proposal for team confirmation: Qazybai Ali leads workflow and backend design, server policy, database consistency and integration tests; Dias Saqyp leads UX, prototype refinement, comparisons and usability study preparation. Both students should review literature, requirements and architecture. Individual Git authorship and reciprocal PR review must be evidenced separately. Askar Khaimuldin is the supervisor for scope, requirements, architecture and evaluation checkpoints.</w:t>
       </w:r>
     </w:p>
     <w:p>
       <w:r>
-        <w:t>The package was prepared with assistance. Prepared files and any assistant commits do not establish progressive individual student contributions. Actual student review, edits, pull requests and supervisor feedback must be recorded from this point forward. No backdated history or invented reviews form part of the submission.</w:t>
+        <w:t>The package was prepared with assistance. The interviewer's account documents a real discovery activity but does not establish Git authorship of prepared files. PR #1 was merged without a recorded peer review; the team must not describe that merge as reviewed. Have a second student review the next corrective PR and record comments and resulting changes. No backdated history or invented review forms part of the submission.</w:t>
       </w:r>
     </w:p>
     <w:p>
@@ -15612,7 +16533,7 @@
                 <w:color w:val="172B3A"/>
                 <w:sz w:val="17"/>
               </w:rPr>
-              <w:t>19 October 2026</w:t>
+              <w:t>12–19 October 2026</w:t>
             </w:r>
           </w:p>
         </w:tc>
@@ -15644,7 +16565,7 @@
                 <w:color w:val="172B3A"/>
                 <w:sz w:val="17"/>
               </w:rPr>
-              <w:t>Initial analysis, diagrams and prototype package</w:t>
+              <w:t>User discussions in Astana</w:t>
             </w:r>
           </w:p>
         </w:tc>
@@ -15676,7 +16597,7 @@
                 <w:color w:val="172B3A"/>
                 <w:sz w:val="17"/>
               </w:rPr>
-              <w:t>Both, assisted preparation</w:t>
+              <w:t>Dias Saqyp, interviewer-supplied notes</w:t>
             </w:r>
           </w:p>
         </w:tc>
@@ -15708,7 +16629,7 @@
                 <w:color w:val="172B3A"/>
                 <w:sz w:val="17"/>
               </w:rPr>
-              <w:t>Internal consistency and executable prototype checks</w:t>
+              <w:t>Ten conversations reported; five selected as direct internal-workflow evidence</w:t>
             </w:r>
           </w:p>
         </w:tc>
@@ -15745,7 +16666,7 @@
                 <w:color w:val="172B3A"/>
                 <w:sz w:val="17"/>
               </w:rPr>
-              <w:t>20 October 2026</w:t>
+              <w:t>19 October 2026</w:t>
             </w:r>
           </w:p>
         </w:tc>
@@ -15777,7 +16698,7 @@
                 <w:color w:val="172B3A"/>
                 <w:sz w:val="17"/>
               </w:rPr>
-              <w:t>User discovery and client scope</w:t>
+              <w:t>Initial analysis, diagrams and prototype package</w:t>
             </w:r>
           </w:p>
         </w:tc>
@@ -15809,7 +16730,7 @@
                 <w:color w:val="172B3A"/>
                 <w:sz w:val="17"/>
               </w:rPr>
-              <w:t>Dias with Ali</w:t>
+              <w:t>Both, assisted preparation</w:t>
             </w:r>
           </w:p>
         </w:tc>
@@ -15841,7 +16762,7 @@
                 <w:color w:val="172B3A"/>
                 <w:sz w:val="17"/>
               </w:rPr>
-              <w:t>3–5 discussions or substantive client agreement recorded</w:t>
+              <w:t>Internal consistency and executable prototype checks</w:t>
             </w:r>
           </w:p>
         </w:tc>
@@ -16652,7 +17573,7 @@
     </w:p>
     <w:p>
       <w:r>
-        <w:t>The future dates are proposed scheduling targets rather than promises from the supervisor. Repository history begins with actual preparation. Maintain the same repository through later submissions. Links and actual remote state are recorded in management/online_status.md.</w:t>
+        <w:t>The ten conversations were reported for 12–19 October 2026. Other milestone dates in this table are planning targets, not claims of completed supervisor checkpoints. Repository history begins with actual preparation. Maintain the same repository through later submissions. Links and actual remote state are recorded in management/online_status.md.</w:t>
       </w:r>
     </w:p>
     <w:p>
@@ -16842,7 +17763,7 @@
                 <w:color w:val="172B3A"/>
                 <w:sz w:val="17"/>
               </w:rPr>
-              <w:t>No accessible user representatives</w:t>
+              <w:t>Pilot organisation and approval policy not confirmed</w:t>
             </w:r>
           </w:p>
         </w:tc>
@@ -16874,7 +17795,7 @@
                 <w:color w:val="172B3A"/>
                 <w:sz w:val="17"/>
               </w:rPr>
-              <w:t>High and high</w:t>
+              <w:t>Medium and high</w:t>
             </w:r>
           </w:p>
         </w:tc>
@@ -16906,7 +17827,7 @@
                 <w:color w:val="172B3A"/>
                 <w:sz w:val="17"/>
               </w:rPr>
-              <w:t>Dias</w:t>
+              <w:t>Both</w:t>
             </w:r>
           </w:p>
         </w:tc>
@@ -16938,7 +17859,7 @@
                 <w:color w:val="172B3A"/>
                 <w:sz w:val="17"/>
               </w:rPr>
-              <w:t>Recruit across all roles immediately; disclose gap if unavailable by 21 October</w:t>
+              <w:t>Use five selected conversations to define candidate routes; ask a pilot organisation and supervisor to confirm mandatory stages</w:t>
             </w:r>
           </w:p>
         </w:tc>
@@ -17071,7 +17992,7 @@
                 <w:color w:val="172B3A"/>
                 <w:sz w:val="17"/>
               </w:rPr>
-              <w:t>Freeze one reviewer route; defer OCR, signatures and parallel routes</w:t>
+              <w:t>State the one-reviewer prototype limit; decide if sequential approval is a later Must or narrow the pilot with supervisor agreement</w:t>
             </w:r>
           </w:p>
         </w:tc>
@@ -18002,7 +18923,7 @@
                 <w:color w:val="172B3A"/>
                 <w:sz w:val="17"/>
               </w:rPr>
-              <w:t>Own accounts, real task branches and reciprocal PR reviews from now</w:t>
+              <w:t>Record genuine student edits and reciprocal review on the corrective PR; PR #1 merge did not have recorded peer review</w:t>
             </w:r>
           </w:p>
         </w:tc>
@@ -18023,7 +18944,7 @@
     </w:p>
     <w:p>
       <w:r>
-        <w:t>Use the YouTrack project linked in the README. Each task needs an actual assignee, priority, expected artifact, acceptance criteria and due date. The prepared backlog contains these fields. Only mark a task Done when its acceptance criteria have been reviewed. Unknown account mappings remain explicit rather than assigning work to a fictional identity.</w:t>
+        <w:t>Use the YouTrack project linked in the README. Each meaningful task needs an actual assignee, priority, expected artifact, acceptance criteria and due date. Only mark a task Done after its criteria have been reviewed. Link the interview analysis and resulting route decision to their actual tasks; do not backdate or assign work to a fictional account.</w:t>
       </w:r>
     </w:p>
     <w:p>
@@ -18033,7 +18954,7 @@
     </w:p>
     <w:p>
       <w:r>
-        <w:t>Before submission, grant the committee and supervisor appropriate access, confirm the repository and YouTrack links, merge reviewed work and create pre-defense-1 at the actual reviewed commit. Do not move submitted tags. Later stages use pre-defense-2 and final-pre-defense. Do not tag an unreviewed package as approved merely because the date has arrived.</w:t>
+        <w:t>At this review, PR #1 had been merged without a recorded peer review and the pre-defense-1 tag was absent. Before submission, confirm committee and supervisor access, check the repository and YouTrack links, and obtain a genuine peer review of the corrective PR. Create pre-defense-1 only at the actual reviewed submission commit and do not move it later. An earlier unreviewed merge must not be represented as approved.</w:t>
       </w:r>
     </w:p>
     <w:p>
@@ -18059,7 +18980,7 @@
     </w:p>
     <w:p>
       <w:r>
-        <w:t>The ready-to-use review form asks the supervisor to assess problem specificity, the proposed user group, the build-versus-configure decision, single-stage scope, the evidence behind mandatory requirements, version and access invariants, evaluation validity and the next implementation increment. The form includes fields for actual comment, decision, owner, due date, changed artifact and verification link.</w:t>
+        <w:t>The ready-to-use review form asks the supervisor to assess the specific problem and target group, the build-versus-configure decision, the single-reviewer prototype gap against multi-stage interview accounts, evidence behind mandatory requirements, version and access invariants, evaluation validity and the next implementation increment. It includes fields for actual comment, decision, owner, due date, changed artifact and verification link.</w:t>
       </w:r>
     </w:p>
     <w:p>
@@ -18285,7 +19206,7 @@
                 <w:color w:val="172B3A"/>
                 <w:sz w:val="18"/>
               </w:rPr>
-              <w:t>Validate departmental setting</w:t>
+              <w:t>Confirm departmental pilot scope and selected document type with supervisor</w:t>
             </w:r>
           </w:p>
         </w:tc>
@@ -18354,7 +19275,7 @@
                 <w:color w:val="172B3A"/>
                 <w:sz w:val="18"/>
               </w:rPr>
-              <w:t>Literature context, protocol and blank evidence register</w:t>
+              <w:t>Ten user conversations reported by Dias Saqyp; five anonymised in-scope accounts with dates and formats</w:t>
             </w:r>
           </w:p>
         </w:tc>
@@ -18386,7 +19307,7 @@
                 <w:color w:val="172B3A"/>
                 <w:sz w:val="18"/>
               </w:rPr>
-              <w:t>Conduct 3–5 discussions or obtain client agreement</w:t>
+              <w:t>Reconcile one-reviewer prototype with multi-stage accounts; confirm route policy and review evidence with supervisor</w:t>
             </w:r>
           </w:p>
         </w:tc>
@@ -18455,7 +19376,7 @@
                 <w:color w:val="172B3A"/>
                 <w:sz w:val="18"/>
               </w:rPr>
-              <w:t>Eight scientific publications and 25-source register</w:t>
+              <w:t>Ten scientific publications and 30-source register</w:t>
             </w:r>
           </w:p>
         </w:tc>
@@ -18556,7 +19477,7 @@
                 <w:color w:val="172B3A"/>
                 <w:sz w:val="18"/>
               </w:rPr>
-              <w:t>Four systems with eight consistent criteria</w:t>
+              <w:t>Five systems with eight consistent criteria, including Kazakhstan market</w:t>
             </w:r>
           </w:p>
         </w:tc>
@@ -18790,7 +19711,7 @@
                 <w:color w:val="172B3A"/>
                 <w:sz w:val="18"/>
               </w:rPr>
-              <w:t>Review and baseline with users and supervisor</w:t>
+              <w:t>Resolve FR06 one-reviewer limit against selected accounts, then review baseline with supervisor</w:t>
             </w:r>
           </w:p>
         </w:tc>
@@ -18859,7 +19780,7 @@
                 <w:color w:val="172B3A"/>
                 <w:sz w:val="18"/>
               </w:rPr>
-              <w:t>Context, use case, draft component and state diagrams</w:t>
+              <w:t>Six editable diagrams: context, use case, component/container, state, ER and sequence; ER and sequence added for EDFS-7</w:t>
             </w:r>
           </w:p>
         </w:tc>
@@ -19194,7 +20115,7 @@
                 <w:color w:val="172B3A"/>
                 <w:sz w:val="18"/>
               </w:rPr>
-              <w:t>Confirm accounts, contributions and remote review activity</w:t>
+              <w:t>Record genuine peer review and individual contributions; PR #1 was merged without recorded peer review; tag absent</w:t>
             </w:r>
           </w:p>
         </w:tc>
@@ -19295,7 +20216,7 @@
                 <w:color w:val="172B3A"/>
                 <w:sz w:val="18"/>
               </w:rPr>
-              <w:t>Obtain real feedback and implement changes</w:t>
+              <w:t>Obtain real feedback, record its date and decisions, and implement resulting changes</w:t>
             </w:r>
           </w:p>
         </w:tc>
@@ -19316,7 +20237,7 @@
     </w:p>
     <w:p>
       <w:r>
-        <w:t>This version supplies analysis and design artifacts plus an interactive text-document prototype. It does not provide a production application or measured organisational benefit. It discloses missing local validation, unexecuted backend tests and absent supervisor feedback. The original checklist allows an incomplete application at this stage, but does require actual analysis, planning, supervision and progressive contributions. Templates prepare that work but cannot substitute for its occurrence.</w:t>
+        <w:t>This version supplies analysis and design artifacts, ten interviewer-attested user conversations (five selected for direct relevance), and an interactive text-document prototype. It does not provide a production application or measured organisational benefit. Only prototype model tests have been executed; backend, security, performance and user outcome checks remain planned. Supervisor feedback, recorded peer review of the corrective PR and a pre-defense-1 tag are outstanding. A complete application is not required now, but progressive student contributions and real supervision must be demonstrable.</w:t>
       </w:r>
     </w:p>
     <w:p>
@@ -19610,6 +20531,36 @@
           <w:sz w:val="18"/>
         </w:rPr>
         <w:t>[S25] OWASP. File Upload Cheat Sheet. https://cheatsheetseries.owasp.org/cheatsheets/File_Upload_Cheat_Sheet.html. Accessed 19 October 2026. Used for: Upload validation, quarantine and storage design.</w:t>
+      </w:r>
+    </w:p>
+    <w:p>
+      <w:pPr/>
+      <w:r>
+        <w:t>[S26] S. Bayona-Oré and M. Reyes (2025). Challenges in the technological adoption of document management systems. TELKOMNIKA (Telecommunication Computing Electronics and Control) 23(2), 340–348. https://doi.org/10.12928/TELKOMNIKA.v23i2.26372. Inspected: Publisher abstract and citation record; cross-sectional survey of 998 public-sector workers.</w:t>
+      </w:r>
+    </w:p>
+    <w:p>
+      <w:pPr/>
+      <w:r>
+        <w:t>[S27] R. Nurbatyrova, B. Japarov, N. Apakhayev, B. Abdulaziz and S. Khushkeldiyeva (2024). Digital Transformation of Archives in the Context of the Introduction of an Electronic Document Management System in Kazakhstan. Preservation, Digital Technology &amp; Culture 53(3), 147–155. https://doi.org/10.1515/pdtc-2024-0017. Inspected: Publisher abstract and Crossref citation record; theoretical state-archives focus.</w:t>
+      </w:r>
+    </w:p>
+    <w:p>
+      <w:pPr/>
+      <w:r>
+        <w:t>[S28] d8n.ai by Documentolog. Управление нормативными документами (Management of Internal Regulatory Documents). https://d8n.kz/ru/solutions/norm/. Accessed 23 October 2026. Used for: Current enterprise offering’s routed approval, version history, access, action history and configuration needs. Vendor documentation; exact technical semantics remain unverified.</w:t>
+      </w:r>
+    </w:p>
+    <w:p>
+      <w:pPr/>
+      <w:r>
+        <w:t>[S29] Register of Trusted Software and Electronic Industry Products of Kazakhstan. Documentolog Platform entry. https://www.rsp.gov.kz/ru/rdpo?page=34. Accessed 23 October 2026. Used for: Local product identity, document-oriented process automation and external-integration claims.</w:t>
+      </w:r>
+    </w:p>
+    <w:p>
+      <w:pPr/>
+      <w:r>
+        <w:t>[S30] Documentolog. Первые клиенты уже обновлены на d8n.ai (First customers have been upgraded to d8n.ai), 31 March 2026. https://documentolog.com/blog/pervye-klienty-uzhe-obnovleny-na-d8n-ai. Accessed 23 October 2026. Used for: Vendor-reported migration of Documentolog Platform clients to d8n.ai; does not establish feature equivalence.</w:t>
       </w:r>
     </w:p>
     <w:sectPr>

</xml_diff>

<commit_message>
EDFS-9: prepare evaluation and portable pre-defense materials
Assistant-prepared changes for student review. This commit does not establish individual student authorship or peer approval.

Correct the status after PR #2 merged, fix historical-version preview in the browser demo, and add evaluation templates and a portable slide deck.
</commit_message>
<xml_diff>
--- a/docs/EDFS_Report.docx
+++ b/docs/EDFS_Report.docx
@@ -78,7 +78,7 @@
         <w:br/>
         <w:t>Prepared 19 October 2026</w:t>
         <w:br/>
-        <w:t>Updated 23 October 2026</w:t>
+        <w:t>Updated 24 October 2026</w:t>
         <w:br/>
         <w:t>Proposed requirements baseline 0.2</w:t>
       </w:r>
@@ -13021,7 +13021,7 @@
     </w:p>
     <w:p>
       <w:r>
-        <w:t>User has a role and active flag. Document stores owner, type, status, current version ID and revision counter. DocumentVersion stores a unique document and version number, immutable storage key, SHA-256 hash, content type and creation time. ReviewCycle references exactly one version and reviewer. AuditEvent stores event ID, actor, document, version, action, timestamp and safe context. NotificationOutbox stores an event key, recipient, status, attempt count and next retry time.</w:t>
+        <w:t>User has a role and active flag. Document stores owner, title, type, status, current version ID and revision counter. Each immutable DocumentVersion has a unique number and creator, plus either validated text or a PDF/DOCX object key, SHA-256 hash, content type and size. ReviewCycle references one version and reviewer. AuditEvent records actor, document, version, action and time. NotificationOutbox records an event key, recipient, status and retry data.</w:t>
       </w:r>
     </w:p>
     <w:p>
@@ -13039,7 +13039,7 @@
     </w:p>
     <w:p>
       <w:r>
-        <w:t>The server accepts only allowed PDF or DOCX inputs within the configured size limit, checks content independently of the browser header and scans in quarantine [S25]. Only after validation does it publish a version reference. Downloads require an authenticated policy check and attachment disposition. Database backup and object backup must use a consistent manifest. Unreferenced staged objects are cleaned after a safe interval. Audit access avoids storing file bytes or authentication secrets.</w:t>
+        <w:t>The server validates text versions and accepts only allowed PDF or DOCX binary uploads within the configured size limit. It checks binary content independently of the browser header and scans uploads in quarantine [S25]. Only after validation does it publish a version reference. Downloads require an authenticated policy check and attachment disposition. Database and object backups need a consistent manifest; unreferenced staged objects are cleaned safely. Audit events contain no file bytes or authentication secrets.</w:t>
       </w:r>
     </w:p>
     <w:p>
@@ -13052,7 +13052,7 @@
     </w:p>
     <w:p>
       <w:r>
-        <w:t>POST /documents creates a draft and returns 201 with document ID and revision. POST /documents/{id}/versions creates an immutable version after validation. POST /documents/{id}/submit accepts reviewer ID and If-Match revision. POST /reviews/{id}/decision accepts approve or return and a comment. GET /documents?q=...&amp;status=... applies policy before returning results. GET /documents/{id}/events exports authorised history. Invalid input returns 400, absent authentication 401, denied access 403 or a non-disclosing 404, and stale commands 409. These endpoints are proposed and are not hosted backend routes in this delivery.</w:t>
+        <w:t>POST /documents creates a text draft and returns 201 with document ID and revision. POST /documents/{id}/versions creates an immutable text or validated binary version. POST /documents/{id}/submit accepts reviewer ID and an If-Match revision token. POST /reviews/{id}/decision accepts approve or return, a required reason for return, and an If-Match token. GET /documents?q=...&amp;status=... applies policy before returning results. GET /documents/{id}/events exports authorised history. Invalid input returns 400, absent authentication 401, denied access 403 or a non-disclosing 404, and stale commands 409. These endpoints are proposed, not hosted backend routes in this delivery.</w:t>
       </w:r>
     </w:p>
     <w:p>
@@ -16343,7 +16343,7 @@
     </w:p>
     <w:p>
       <w:r>
-        <w:t>The package was prepared with assistance. The interviewer's account documents a real discovery activity but does not establish Git authorship of prepared files. PR #1 was merged without a recorded peer review; the team must not describe that merge as reviewed. Have a second student review the next corrective PR and record comments and resulting changes. No backdated history or invented review forms part of the submission.</w:t>
+        <w:t>The package was prepared with assistance. The interviewer's account documents a real discovery activity but does not establish Git authorship of prepared files. PR #1 was merged without a recorded peer review; the team must not describe that merge as reviewed. PR #2 also merged without a submitted peer review on 23 October 2026. Another student must review a subsequent substantive PR before it is merged, with comments and resulting changes recorded. No backdated history or invented review forms part of the submission.</w:t>
       </w:r>
     </w:p>
     <w:p>
@@ -18923,7 +18923,7 @@
                 <w:color w:val="172B3A"/>
                 <w:sz w:val="17"/>
               </w:rPr>
-              <w:t>Record genuine student edits and reciprocal review on the corrective PR; PR #1 merge did not have recorded peer review</w:t>
+              <w:t>Record genuine student edits and review the next substantive PR before merge; PRs #1 and #2 lacked submitted peer reviews</w:t>
             </w:r>
           </w:p>
         </w:tc>
@@ -18949,12 +18949,12 @@
     </w:p>
     <w:p>
       <w:r>
-        <w:t>Use task IDs in branch names such as EDFS-12-approval-policy and in commit or PR descriptions. Add the resulting commit or PR link back to the task. Keep main as the reviewed baseline and submit coherent changes through PRs. Documentation and diagrams require review too. The repository includes PR and issue templates, a CI workflow and an ignore file. Do not commit passwords, API keys, real participant notes or runtime data.</w:t>
+        <w:t>Use task IDs in branch names such as EDFS-12-approval-policy and in commit or PR descriptions. Add the resulting commit or PR link back to the task. For future work, keep main as a reviewed baseline by submitting coherent changes through PRs; its present history includes two unreviewed merges. Documentation and diagrams require review too. The repository includes PR and issue templates, a CI workflow and an ignore file. Do not commit passwords, API keys, real participant notes or runtime data.</w:t>
       </w:r>
     </w:p>
     <w:p>
       <w:r>
-        <w:t>At this review, PR #1 had been merged without a recorded peer review and the pre-defense-1 tag was absent. Before submission, confirm committee and supervisor access, check the repository and YouTrack links, and obtain a genuine peer review of the corrective PR. Create pre-defense-1 only at the actual reviewed submission commit and do not move it later. An earlier unreviewed merge must not be represented as approved.</w:t>
+        <w:t>At this review, PRs #1 and #2 had both been merged without submitted peer reviews, and the pre-defense-1 tag was absent. Before submission, confirm committee and supervisor access and check the repository and YouTrack links. The university requires another student to review a substantive PR before it is merged; obtain and record that review on a subsequent PR. Create pre-defense-1 only at the actual reviewed submission commit and do not move it later. Neither earlier unreviewed merge may be represented as approved.</w:t>
       </w:r>
     </w:p>
     <w:p>
@@ -20115,7 +20115,7 @@
                 <w:color w:val="172B3A"/>
                 <w:sz w:val="18"/>
               </w:rPr>
-              <w:t>Record genuine peer review and individual contributions; PR #1 was merged without recorded peer review; tag absent</w:t>
+              <w:t>Record individual contributions and a pre-merge peer review on a subsequent PR; PRs #1 and #2 lacked reviews; tag absent</w:t>
             </w:r>
           </w:p>
         </w:tc>
@@ -20237,7 +20237,7 @@
     </w:p>
     <w:p>
       <w:r>
-        <w:t>This version supplies analysis and design artifacts, ten interviewer-attested user conversations (five selected for direct relevance), and an interactive text-document prototype. It does not provide a production application or measured organisational benefit. Only prototype model tests have been executed; backend, security, performance and user outcome checks remain planned. Supervisor feedback, recorded peer review of the corrective PR and a pre-defense-1 tag are outstanding. A complete application is not required now, but progressive student contributions and real supervision must be demonstrable.</w:t>
+        <w:t>This version supplies analysis and design artifacts, ten interviewer-attested user conversations (five selected for direct relevance), and an interactive text-document prototype. It does not provide a production application or measured organisational benefit. Only prototype model tests have been executed; backend, security, performance and user outcome checks remain planned. Supervisor feedback, genuine peer review before the next substantive PR merge, and a pre-defense-1 tag are outstanding. A complete application is not required now, but progressive student contributions and real supervision must be demonstrable.</w:t>
       </w:r>
     </w:p>
     <w:p>

</xml_diff>

<commit_message>
EDFS-10: streamline pre-defense package (assistant-prepared, student review required)
</commit_message>
<xml_diff>
--- a/docs/EDFS_Report.docx
+++ b/docs/EDFS_Report.docx
@@ -176,7 +176,7 @@
     </w:p>
     <w:p>
       <w:r>
-        <w:t>README.md explains how to run the prototype and tests. docs/ contains editable section sources. diagrams/ contains .drawio sources and readable exports. management/ contains backlog, interview and supervisor forms, study templates and the submission record. evidence/ records sources and actual verification. config/ holds the proposed schema and safe configuration example.</w:t>
+        <w:t>README.md explains how to run the prototype. docs/ contains the analysis and evaluation plan. diagrams/ contains the three required editable .drawio sources and readable exports. management/ holds anonymised interview summaries, the YouTrack evidence map, current status, presentation script and unfilled supervisor and submission records; its README explains the folder. evidence/ records sources and actual verification. config/ holds the proposed schema and safe configuration example. The tests/ folder is retained for later implementation work and existing model checks.</w:t>
       </w:r>
     </w:p>
     <w:p>
@@ -1404,7 +1404,7 @@
     </w:p>
     <w:p>
       <w:r>
-        <w:t>An anonymised summary is now included in this report. The prepared blank interview form and evidence register in management/ remain tools for follow-up; their existence does not replace or invalidate the reported conversations. The interviewer identity and dates are recorded, but participants and companies are withheld. Ask participants to check summaries if feasible, then seek supervisor review of the proposed route and requirement changes. Do not publish raw identifiable notes.</w:t>
+        <w:t>An anonymised summary is included in this report and in the management evidence log. The interviewer identity and dates are recorded, but participants and companies are withheld. Private original notes and consent records were not independently inspected. Ask participants to check summaries if feasible, then seek supervisor review of the proposed route and requirement changes. Do not publish raw identifiable notes.</w:t>
       </w:r>
     </w:p>
     <w:p>
@@ -12849,7 +12849,7 @@
     </w:p>
     <w:p>
       <w:r>
-        <w:t>The editable .drawio files and readable SVG and PNG exports in diagrams/ are part of this package. Six diagrams cover the system: context, UML use case, draft UML component/container, state, ER and sequence. The ER and sequence diagrams were added for EDFS-7. They are design artifacts for the later server implementation, not evidence of a deployed backend.</w:t>
+        <w:t>The editable .drawio files and readable SVG and PNG exports in diagrams/ are part of this package. The three diagrams required for the first pre-defense are the system context, UML use case and draft UML component diagrams. They are design artifacts for the later server implementation, not evidence of a deployed backend. The lifecycle and data constraints are described in the text and proposed schema.</w:t>
       </w:r>
     </w:p>
     <w:p>
@@ -16317,7 +16317,7 @@
     </w:p>
     <w:p>
       <w:r>
-        <w:t>The delivery includes executable prototype model tests and a separate actual verification record. Security, concurrency, performance, recovery and user outcomes remain unmeasured on a production backend. The blank study CSV in management/ provides the fields needed for later collection. Failed acceptance criteria become tracked tasks before the next release tag.</w:t>
+        <w:t>The delivery includes a verification plan, existing executable prototype model checks and a separate actual verification record. The tests/ folder remains in the repository; no new automated tests are needed for this analysis and design submission. Security, concurrency, performance, recovery and user outcomes remain unmeasured on a production backend. The blank study template in docs/evaluation/ provides fields for later collection. Failed acceptance criteria become tracked tasks before the next release tag.</w:t>
       </w:r>
     </w:p>
     <w:p>
@@ -16343,7 +16343,7 @@
     </w:p>
     <w:p>
       <w:r>
-        <w:t>The package was prepared with assistance. The interviewer's account documents a real discovery activity but does not establish Git authorship of prepared files. PR #1 was merged without a recorded peer review; the team must not describe that merge as reviewed. PR #2 also merged without a submitted peer review on 23 October 2026. Another student must review a subsequent substantive PR before it is merged, with comments and resulting changes recorded. No backdated history or invented review forms part of the submission.</w:t>
+        <w:t>The package was prepared with assistance. The interviewer's account documents a real discovery activity but does not establish Git authorship of prepared files. PRs #1, #2 and #3 were merged without submitted peer reviews; PR #3 merged on 24 October 2026. The team must not describe those merges as reviewed. Another student must personally review a subsequent substantive PR before it is merged, with comments and resulting changes recorded. No backdated history or invented review forms part of the submission.</w:t>
       </w:r>
     </w:p>
     <w:p>
@@ -18923,7 +18923,7 @@
                 <w:color w:val="172B3A"/>
                 <w:sz w:val="17"/>
               </w:rPr>
-              <w:t>Record genuine student edits and review the next substantive PR before merge; PRs #1 and #2 lacked submitted peer reviews</w:t>
+              <w:t>Record genuine student edits and review the next substantive PR before merge; PRs #1–#3 lacked submitted peer reviews</w:t>
             </w:r>
           </w:p>
         </w:tc>
@@ -18949,12 +18949,12 @@
     </w:p>
     <w:p>
       <w:r>
-        <w:t>Use task IDs in branch names such as EDFS-12-approval-policy and in commit or PR descriptions. Add the resulting commit or PR link back to the task. For future work, keep main as a reviewed baseline by submitting coherent changes through PRs; its present history includes two unreviewed merges. Documentation and diagrams require review too. The repository includes PR and issue templates, a CI workflow and an ignore file. Do not commit passwords, API keys, real participant notes or runtime data.</w:t>
+        <w:t>Use task IDs in branch names such as EDFS-12-approval-policy and in commit or PR descriptions. Add the resulting commit or PR link back to the task. For future work, seek genuine student review of a substantive PR before merge; main currently includes three unreviewed PR merges. Documentation and diagrams require review too. The repository includes PR and issue templates, a CI workflow and an ignore file. Do not commit passwords, API keys, real participant notes or runtime data.</w:t>
       </w:r>
     </w:p>
     <w:p>
       <w:r>
-        <w:t>At this review, PRs #1 and #2 had both been merged without submitted peer reviews, and the pre-defense-1 tag was absent. Before submission, confirm committee and supervisor access and check the repository and YouTrack links. The university requires another student to review a substantive PR before it is merged; obtain and record that review on a subsequent PR. Create pre-defense-1 only at the actual reviewed submission commit and do not move it later. Neither earlier unreviewed merge may be represented as approved.</w:t>
+        <w:t>At this review, PRs #1, #2 and #3 had been merged without submitted peer reviews, and the pre-defense-1 tag was absent. Before submission, confirm committee and supervisor access and check the repository and YouTrack links. The university requires another student to personally review a substantive PR before it is merged; obtain and record that review on a subsequent PR. Create pre-defense-1 only at the actual reviewed submission commit and do not move it later. Earlier unreviewed merges may not be represented as approved.</w:t>
       </w:r>
     </w:p>
     <w:p>
@@ -19780,7 +19780,7 @@
                 <w:color w:val="172B3A"/>
                 <w:sz w:val="18"/>
               </w:rPr>
-              <w:t>Six editable diagrams: context, use case, component/container, state, ER and sequence; ER and sequence added for EDFS-7</w:t>
+              <w:t>Three required editable diagrams: system context, UML use case and draft UML component; each has SVG and PNG exports</w:t>
             </w:r>
           </w:p>
         </w:tc>
@@ -20083,7 +20083,7 @@
                 <w:color w:val="172B3A"/>
                 <w:sz w:val="18"/>
               </w:rPr>
-              <w:t>Backlog, responsibilities, milestones, risks and repository structure</w:t>
+              <w:t>YouTrack task map, responsibilities, milestones, risks and repository structure</w:t>
             </w:r>
           </w:p>
         </w:tc>
@@ -20115,7 +20115,7 @@
                 <w:color w:val="172B3A"/>
                 <w:sz w:val="18"/>
               </w:rPr>
-              <w:t>Record individual contributions and a pre-merge peer review on a subsequent PR; PRs #1 and #2 lacked reviews; tag absent</w:t>
+              <w:t>Record individual contributions and a pre-merge peer review on a subsequent PR; PRs #1–#3 lacked reviews; tag absent</w:t>
             </w:r>
           </w:p>
         </w:tc>

</xml_diff>

<commit_message>
EDFS-10: reconcile first pre-defense evidence and task criteria (assistant-prepared; peer review required)
</commit_message>
<xml_diff>
--- a/docs/EDFS_Report.docx
+++ b/docs/EDFS_Report.docx
@@ -1425,17 +1425,17 @@
     </w:p>
     <w:p>
       <w:r>
-        <w:t>This targeted scoping review asks which EDMS adoption issues matter, how workflow correctness should be represented, and how access control affects document processing. Searches on 19 October 2026 used combinations of electronic document management system, electronic records, workflow, business process management, digital transformation, authorization and access control. Publisher pages, author-hosted papers and official technical documentation were preferred.</w:t>
+        <w:t>This targeted scoping review asks which EDMS adoption issues matter, how workflow correctness should be represented, and how access control affects document processing. Exploratory searches on 19 and 23 October 2026 were not logged sufficiently to reproduce. A targeted update on 24 October searched OpenAlex with exact queries and screening limits recorded in docs/research/search_log_2026-10-24.md. Scientific DOI metadata was checked against Crossref. Publisher and indexed article materials support findings only to the depth available.</w:t>
       </w:r>
     </w:p>
     <w:p>
       <w:r>
-        <w:t>The scientific core contains ten publications. Eight date from 2022–2025 and fall within the preceding five years. Two foundational papers from 1996 and 1998 explain RBAC and explicit workflow reasoning. Technical documentation supports implementation decisions but does not count toward the ten scientific publications. The complete register contains 30 meaningfully used sources.</w:t>
+        <w:t>The scientific core contains twelve publications. Ten date from 2022–2026 and fall within the preceding five years. Two foundational papers from 1996 and 1998 explain RBAC and explicit workflow reasoning. Technical and vendor documentation supports implementation decisions but does not count toward the twelve scientific publications. The complete source register contains 32 meaningfully used sources.</w:t>
       </w:r>
     </w:p>
     <w:p>
       <w:r>
-        <w:t>Selection required identifiable authors, a scholarly venue and a direct connection to the review questions. Broad promotional articles and unverifiable papers were excluded. This is not a claimed exhaustive database search or a PRISMA systematic review. Some publisher pages expose only abstracts and selected sections. The table states the inspected evidence, and no detailed findings beyond that evidence are asserted. Before final diploma submission, deepen the review with full texts and record any changed conclusions.</w:t>
+        <w:t>Selection required identifiable authors, a scholarly venue, a verified DOI and a direct connection to the review questions. Promotional pages, duplicate records, unrelated clinical health records and unverifiable papers were excluded from the scientific count. This is a targeted review, not an exhaustive database search or PRISMA systematic review. The OpenAlex query, screening decisions and DOI verification are recorded in docs/research/. Some articles were inspected only through abstracts or selected sections, and the table states those limits. Before final diploma submission, deepen the review with full texts where available and record any changed conclusions.</w:t>
       </w:r>
     </w:p>
     <w:p>
@@ -2923,6 +2923,272 @@
           </w:p>
         </w:tc>
       </w:tr>
+      <w:tr>
+        <w:trPr>
+          <w:cantSplit/>
+        </w:trPr>
+        <w:tc>
+          <w:tcPr>
+            <w:tcW w:type="dxa" w:w="1628"/>
+            <w:vAlign w:val="center"/>
+            <w:tcBorders>
+              <w:top w:val="single" w:sz="4" w:color="D9D9D9"/>
+              <w:left w:val="single" w:sz="4" w:color="D9D9D9"/>
+              <w:bottom w:val="single" w:sz="4" w:color="D9D9D9"/>
+              <w:right w:val="single" w:sz="4" w:color="D9D9D9"/>
+            </w:tcBorders>
+            <w:tcMar>
+              <w:top w:w="85" w:type="dxa"/>
+              <w:bottom w:w="85" w:type="dxa"/>
+              <w:left w:w="85" w:type="dxa"/>
+              <w:right w:w="85" w:type="dxa"/>
+            </w:tcMar>
+            <w:shd w:fill="FFFFFF"/>
+          </w:tcPr>
+          <w:p>
+            <w:pPr>
+              <w:spacing w:after="60" w:line="252" w:lineRule="auto"/>
+            </w:pPr>
+            <w:r>
+              <w:rPr>
+                <w:b w:val="0"/>
+                <w:color w:val="172B3A"/>
+                <w:sz w:val="17"/>
+              </w:rPr>
+              <w:t>S31 2026</w:t>
+            </w:r>
+          </w:p>
+        </w:tc>
+        <w:tc>
+          <w:tcPr>
+            <w:tcW w:type="dxa" w:w="2586"/>
+            <w:vAlign w:val="center"/>
+            <w:tcBorders>
+              <w:top w:val="single" w:sz="4" w:color="D9D9D9"/>
+              <w:left w:val="single" w:sz="4" w:color="D9D9D9"/>
+              <w:bottom w:val="single" w:sz="4" w:color="D9D9D9"/>
+              <w:right w:val="single" w:sz="4" w:color="D9D9D9"/>
+            </w:tcBorders>
+            <w:tcMar>
+              <w:top w:w="85" w:type="dxa"/>
+              <w:bottom w:w="85" w:type="dxa"/>
+              <w:left w:w="85" w:type="dxa"/>
+              <w:right w:w="85" w:type="dxa"/>
+            </w:tcMar>
+            <w:shd w:fill="FFFFFF"/>
+          </w:tcPr>
+          <w:p>
+            <w:pPr>
+              <w:spacing w:after="60" w:line="252" w:lineRule="auto"/>
+            </w:pPr>
+            <w:r>
+              <w:rPr>
+                <w:b w:val="0"/>
+                <w:color w:val="172B3A"/>
+                <w:sz w:val="17"/>
+              </w:rPr>
+              <w:t>Qualitative thematic review of 57 ERMS studies from 2012–2026. Publisher abstract, methods and discussion sections.</w:t>
+            </w:r>
+          </w:p>
+        </w:tc>
+        <w:tc>
+          <w:tcPr>
+            <w:tcW w:type="dxa" w:w="2969"/>
+            <w:vAlign w:val="center"/>
+            <w:tcBorders>
+              <w:top w:val="single" w:sz="4" w:color="D9D9D9"/>
+              <w:left w:val="single" w:sz="4" w:color="D9D9D9"/>
+              <w:bottom w:val="single" w:sz="4" w:color="D9D9D9"/>
+              <w:right w:val="single" w:sz="4" w:color="D9D9D9"/>
+            </w:tcBorders>
+            <w:tcMar>
+              <w:top w:w="85" w:type="dxa"/>
+              <w:bottom w:w="85" w:type="dxa"/>
+              <w:left w:w="85" w:type="dxa"/>
+              <w:right w:w="85" w:type="dxa"/>
+            </w:tcMar>
+            <w:shd w:fill="FFFFFF"/>
+          </w:tcPr>
+          <w:p>
+            <w:pPr>
+              <w:spacing w:after="60" w:line="252" w:lineRule="auto"/>
+            </w:pPr>
+            <w:r>
+              <w:rPr>
+                <w:b w:val="0"/>
+                <w:color w:val="172B3A"/>
+                <w:sz w:val="17"/>
+              </w:rPr>
+              <w:t>Governance, infrastructure, staff capacity and interoperability interact in implementation. Mixed settings and English-only selection limit transfer to one Astana department.</w:t>
+            </w:r>
+          </w:p>
+        </w:tc>
+        <w:tc>
+          <w:tcPr>
+            <w:tcW w:type="dxa" w:w="2394"/>
+            <w:vAlign w:val="center"/>
+            <w:tcBorders>
+              <w:top w:val="single" w:sz="4" w:color="D9D9D9"/>
+              <w:left w:val="single" w:sz="4" w:color="D9D9D9"/>
+              <w:bottom w:val="single" w:sz="4" w:color="D9D9D9"/>
+              <w:right w:val="single" w:sz="4" w:color="D9D9D9"/>
+            </w:tcBorders>
+            <w:tcMar>
+              <w:top w:w="85" w:type="dxa"/>
+              <w:bottom w:w="85" w:type="dxa"/>
+              <w:left w:w="85" w:type="dxa"/>
+              <w:right w:w="85" w:type="dxa"/>
+            </w:tcMar>
+            <w:shd w:fill="FFFFFF"/>
+          </w:tcPr>
+          <w:p>
+            <w:pPr>
+              <w:spacing w:after="60" w:line="252" w:lineRule="auto"/>
+            </w:pPr>
+            <w:r>
+              <w:rPr>
+                <w:b w:val="0"/>
+                <w:color w:val="172B3A"/>
+                <w:sz w:val="17"/>
+              </w:rPr>
+              <w:t>Check governance rules, metadata and onboarding with pilot users before expanding integrations.</w:t>
+            </w:r>
+          </w:p>
+        </w:tc>
+      </w:tr>
+      <w:tr>
+        <w:trPr>
+          <w:cantSplit/>
+        </w:trPr>
+        <w:tc>
+          <w:tcPr>
+            <w:tcW w:type="dxa" w:w="1628"/>
+            <w:vAlign w:val="center"/>
+            <w:tcBorders>
+              <w:top w:val="single" w:sz="4" w:color="D9D9D9"/>
+              <w:left w:val="single" w:sz="4" w:color="D9D9D9"/>
+              <w:bottom w:val="single" w:sz="4" w:color="D9D9D9"/>
+              <w:right w:val="single" w:sz="4" w:color="D9D9D9"/>
+            </w:tcBorders>
+            <w:tcMar>
+              <w:top w:w="85" w:type="dxa"/>
+              <w:bottom w:w="85" w:type="dxa"/>
+              <w:left w:w="85" w:type="dxa"/>
+              <w:right w:w="85" w:type="dxa"/>
+            </w:tcMar>
+            <w:shd w:fill="F1F5F7"/>
+          </w:tcPr>
+          <w:p>
+            <w:pPr>
+              <w:spacing w:after="60" w:line="252" w:lineRule="auto"/>
+            </w:pPr>
+            <w:r>
+              <w:rPr>
+                <w:b w:val="0"/>
+                <w:color w:val="172B3A"/>
+                <w:sz w:val="17"/>
+              </w:rPr>
+              <w:t>S32 2025</w:t>
+            </w:r>
+          </w:p>
+        </w:tc>
+        <w:tc>
+          <w:tcPr>
+            <w:tcW w:type="dxa" w:w="2586"/>
+            <w:vAlign w:val="center"/>
+            <w:tcBorders>
+              <w:top w:val="single" w:sz="4" w:color="D9D9D9"/>
+              <w:left w:val="single" w:sz="4" w:color="D9D9D9"/>
+              <w:bottom w:val="single" w:sz="4" w:color="D9D9D9"/>
+              <w:right w:val="single" w:sz="4" w:color="D9D9D9"/>
+            </w:tcBorders>
+            <w:tcMar>
+              <w:top w:w="85" w:type="dxa"/>
+              <w:bottom w:w="85" w:type="dxa"/>
+              <w:left w:w="85" w:type="dxa"/>
+              <w:right w:w="85" w:type="dxa"/>
+            </w:tcMar>
+            <w:shd w:fill="F1F5F7"/>
+          </w:tcPr>
+          <w:p>
+            <w:pPr>
+              <w:spacing w:after="60" w:line="252" w:lineRule="auto"/>
+            </w:pPr>
+            <w:r>
+              <w:rPr>
+                <w:b w:val="0"/>
+                <w:color w:val="172B3A"/>
+                <w:sz w:val="17"/>
+              </w:rPr>
+              <w:t>UTAUT-based survey of 441 public-sector workers in Sabah. Indexed abstract and Crossref citation record.</w:t>
+            </w:r>
+          </w:p>
+        </w:tc>
+        <w:tc>
+          <w:tcPr>
+            <w:tcW w:type="dxa" w:w="2969"/>
+            <w:vAlign w:val="center"/>
+            <w:tcBorders>
+              <w:top w:val="single" w:sz="4" w:color="D9D9D9"/>
+              <w:left w:val="single" w:sz="4" w:color="D9D9D9"/>
+              <w:bottom w:val="single" w:sz="4" w:color="D9D9D9"/>
+              <w:right w:val="single" w:sz="4" w:color="D9D9D9"/>
+            </w:tcBorders>
+            <w:tcMar>
+              <w:top w:w="85" w:type="dxa"/>
+              <w:bottom w:w="85" w:type="dxa"/>
+              <w:left w:w="85" w:type="dxa"/>
+              <w:right w:w="85" w:type="dxa"/>
+            </w:tcMar>
+            <w:shd w:fill="F1F5F7"/>
+          </w:tcPr>
+          <w:p>
+            <w:pPr>
+              <w:spacing w:after="60" w:line="252" w:lineRule="auto"/>
+            </w:pPr>
+            <w:r>
+              <w:rPr>
+                <w:b w:val="0"/>
+                <w:color w:val="172B3A"/>
+                <w:sz w:val="17"/>
+              </w:rPr>
+              <w:t>Reported performance and effort expectancy, facilitating conditions and social factors predict intention to use an EDMS. Intention is not actual usage; one-region survey does not establish causality.</w:t>
+            </w:r>
+          </w:p>
+        </w:tc>
+        <w:tc>
+          <w:tcPr>
+            <w:tcW w:type="dxa" w:w="2394"/>
+            <w:vAlign w:val="center"/>
+            <w:tcBorders>
+              <w:top w:val="single" w:sz="4" w:color="D9D9D9"/>
+              <w:left w:val="single" w:sz="4" w:color="D9D9D9"/>
+              <w:bottom w:val="single" w:sz="4" w:color="D9D9D9"/>
+              <w:right w:val="single" w:sz="4" w:color="D9D9D9"/>
+            </w:tcBorders>
+            <w:tcMar>
+              <w:top w:w="85" w:type="dxa"/>
+              <w:bottom w:w="85" w:type="dxa"/>
+              <w:left w:w="85" w:type="dxa"/>
+              <w:right w:w="85" w:type="dxa"/>
+            </w:tcMar>
+            <w:shd w:fill="F1F5F7"/>
+          </w:tcPr>
+          <w:p>
+            <w:pPr>
+              <w:spacing w:after="60" w:line="252" w:lineRule="auto"/>
+            </w:pPr>
+            <w:r>
+              <w:rPr>
+                <w:b w:val="0"/>
+                <w:color w:val="172B3A"/>
+                <w:sz w:val="17"/>
+              </w:rPr>
+              <w:t>Measure perceived ease of use alongside actual completion of the review task.</w:t>
+            </w:r>
+          </w:p>
+        </w:tc>
+      </w:tr>
     </w:tbl>
     <w:p>
       <w:pPr>
@@ -2939,7 +3205,7 @@
     </w:p>
     <w:p>
       <w:r>
-        <w:t>EDMS reviews [S01, S02] and the DMS adoption survey [S26] support treating adoption, ease of use and staff capability as part of the problem. The survey reports associations rather than causal effects and does not establish an adoption rate for this project. The reported Astana conversations provide examples of version, status and approval-history problems; benefits and usability of the proposed system still require evaluation.</w:t>
+        <w:t>EDMS reviews [S01, S02, S31] and DMS adoption surveys [S26, S32] support treating adoption, ease of use, staff capability and governance as part of the problem. The surveys concern reported intention and associations, not observed use or causal improvement in Astana. The ten reported conversations provide local examples of version, status and approval-history problems; benefits and usability of the proposed system still require evaluation.</w:t>
       </w:r>
     </w:p>
     <w:p>
@@ -7694,7 +7960,7 @@
     </w:p>
     <w:p>
       <w:r>
-        <w:t>Version 0.2 is a proposed baseline informed by the ten Astana conversations reported by Dias Saqyp and awaits pilot-organisation and supervisor validation. Must requirements define the mandatory later implementation for the single-reviewer demonstration slice; FR06 and FR07 cover only one review stage. Candidate CR01 addresses ordered reviewers but is not implemented or committed to the current MVP. Confirm its route policy, priority and tests before adding it to the validated baseline. Should requirements may be deferred with a recorded decision. Neither client-side role simulation nor passing local model tests proves server security.</w:t>
+        <w:t>Version 0.3 is a proposed baseline informed by the ten Astana conversations reported by Dias Saqyp and awaits pilot-organisation and supervisor validation. Must requirements define the mandatory later implementation for the single-reviewer demonstration slice; FR06 and FR07 cover only one review stage. Candidate CR01 addresses ordered reviewers but is not implemented or committed to the current MVP. Confirm its route policy, priority and tests before adding it to the validated baseline. Should requirements may be deferred with a recorded decision. Neither client-side role simulation nor passing local model tests proves server security.</w:t>
       </w:r>
     </w:p>
     <w:p>
@@ -16343,7 +16609,7 @@
     </w:p>
     <w:p>
       <w:r>
-        <w:t>The package was prepared with assistance. The interviewer's account documents a real discovery activity but does not establish Git authorship of prepared files. PRs #1, #2 and #3 were merged without submitted peer reviews; PR #3 merged on 24 October 2026. The team must not describe those merges as reviewed. Another student must personally review a subsequent substantive PR before it is merged, with comments and resulting changes recorded. No backdated history or invented review forms part of the submission.</w:t>
+        <w:t>The package was prepared with assistance. The interviewer's account documents a real discovery activity but does not establish Git authorship of prepared files. PRs #1, #2 and #3 were merged without submitted peer reviews. PR #4 received an APPROVED submission from Al1GaTorr at 08:03:39 UTC on 24 October, before its merge at 08:03:46 UTC. The review body and inline comments were empty; no review-driven revision is claimed. Later substantive PRs must also receive genuine peer review before merge. No backdated history or invented comment forms part of the submission.</w:t>
       </w:r>
     </w:p>
     <w:p>
@@ -17285,16 +17551,8 @@
             <w:shd w:fill="F1F5F7"/>
           </w:tcPr>
           <w:p>
-            <w:pPr>
-              <w:spacing w:after="60" w:line="252" w:lineRule="auto"/>
-            </w:pPr>
-            <w:r>
-              <w:rPr>
-                <w:b w:val="0"/>
-                <w:color w:val="172B3A"/>
-                <w:sz w:val="17"/>
-              </w:rPr>
-              <w:t>Tag reviewed submission, disclose open limitations</w:t>
+            <w:r>
+              <w:t>After actual supervisor feedback, tag the exact reviewed submission and disclose open limitations</w:t>
             </w:r>
           </w:p>
         </w:tc>
@@ -18949,12 +19207,12 @@
     </w:p>
     <w:p>
       <w:r>
-        <w:t>Use task IDs in branch names such as EDFS-12-approval-policy and in commit or PR descriptions. Add the resulting commit or PR link back to the task. For future work, seek genuine student review of a substantive PR before merge; main currently includes three unreviewed PR merges. Documentation and diagrams require review too. The repository includes PR and issue templates, a CI workflow and an ignore file. Do not commit passwords, API keys, real participant notes or runtime data.</w:t>
+        <w:t>Use task IDs in branch names and commit or PR descriptions. Add the resulting commit or PR link back to the task. PR #4 has a submitted peer approval before merge; PRs #1–#3 remain historical unreviewed merges. Each later substantive PR requires another student's review before merge. Documentation and diagrams require review too. The repository includes PR and issue templates, a CI workflow and an ignore file. Do not commit passwords, API keys, real participant notes or runtime data.</w:t>
       </w:r>
     </w:p>
     <w:p>
       <w:r>
-        <w:t>At this review, PRs #1, #2 and #3 had been merged without submitted peer reviews, and the pre-defense-1 tag was absent. Before submission, confirm committee and supervisor access and check the repository and YouTrack links. The university requires another student to personally review a substantive PR before it is merged; obtain and record that review on a subsequent PR. Create pre-defense-1 only at the actual reviewed submission commit and do not move it later. Earlier unreviewed merges may not be represented as approved.</w:t>
+        <w:t>At this review, PR #4 had been approved by Al1GaTorr before merge, while PRs #1–#3 had no submitted peer reviews. The pre-defense-1 tag was absent. Confirm committee and supervisor access and check repository and YouTrack links. Record actual supervisor feedback and the resulting decisions before tagging the exact reviewed version subsequently submitted. Do not move the tag later or describe earlier unreviewed merges as approved. The PR #4 approval contains no written review comments or documented review-driven revision.</w:t>
       </w:r>
     </w:p>
     <w:p>
@@ -19367,16 +19625,8 @@
             <w:shd w:fill="FFFFFF"/>
           </w:tcPr>
           <w:p>
-            <w:pPr>
-              <w:spacing w:after="60" w:line="252" w:lineRule="auto"/>
-            </w:pPr>
-            <w:r>
-              <w:rPr>
-                <w:b w:val="0"/>
-                <w:color w:val="172B3A"/>
-                <w:sz w:val="18"/>
-              </w:rPr>
-              <w:t>Ten scientific publications and 30-source register</w:t>
+            <w:r>
+              <w:t>Twelve scientific publications, 32-source register, structured matrix and documented search update</w:t>
             </w:r>
           </w:p>
         </w:tc>
@@ -20106,16 +20356,8 @@
             <w:shd w:fill="F1F5F7"/>
           </w:tcPr>
           <w:p>
-            <w:pPr>
-              <w:spacing w:after="60" w:line="252" w:lineRule="auto"/>
-            </w:pPr>
-            <w:r>
-              <w:rPr>
-                <w:b w:val="0"/>
-                <w:color w:val="172B3A"/>
-                <w:sz w:val="18"/>
-              </w:rPr>
-              <w:t>Record individual contributions and a pre-merge peer review on a subsequent PR; PRs #1–#3 lacked reviews; tag absent</w:t>
+            <w:r>
+              <w:t>PR #4 received peer approval before merge; PRs #1–#3 remain historically unreviewed. Verify individual contributions, later reviews and actual committee access; tag awaits supervisor feedback.</w:t>
             </w:r>
           </w:p>
         </w:tc>
@@ -20237,12 +20479,12 @@
     </w:p>
     <w:p>
       <w:r>
-        <w:t>This version supplies analysis and design artifacts, ten interviewer-attested user conversations (five selected for direct relevance), and an interactive text-document prototype. It does not provide a production application or measured organisational benefit. Only prototype model tests have been executed; backend, security, performance and user outcome checks remain planned. Supervisor feedback, genuine peer review before the next substantive PR merge, and a pre-defense-1 tag are outstanding. A complete application is not required now, but progressive student contributions and real supervision must be demonstrable.</w:t>
+        <w:t>This version supplies analysis and design artifacts, ten interviewer-attested user conversations (five selected for direct relevance), and an interactive text-document prototype. It does not provide a production application or measured organisational benefit. Only prototype model tests have been executed; backend, security, performance and user outcome checks remain planned. PR #4 received peer approval before merge; PRs #1–#3 did not, and later substantive changes need their own review. Supervisor feedback and a pre-defense-1 tag are outstanding. A complete application is not required now, but progressive student contributions and real supervision must be demonstrable.</w:t>
       </w:r>
     </w:p>
     <w:p>
       <w:r>
-        <w:t>The final submission record must include repository URL, immutable submission tag, YouTrack URL, prototype location, completed-work summary, limitations and outstanding tasks. An unsigned template in management/submission_record.md avoids inventing approval or evidence. During the demonstration, select one real task and trace its acceptance criteria to an artifact, commit, review and verification result. Each student should explain their own changes and the workflow invariants.</w:t>
+        <w:t>The submission record in management/submission_record.md identifies the actual reviewed PR #4 baseline and leaves the immutable tag, committee access and supervisor fields open until verified. During the demonstration, select one real task and trace its acceptance criteria to an artifact, commit, review and verification result. The PR #4 approval has no written comments, so no review-driven revision is claimed. Each student should explain their own changes and the workflow invariants.</w:t>
       </w:r>
     </w:p>
     <w:p>
@@ -20263,10 +20505,7 @@
         <w:spacing w:after="200"/>
       </w:pPr>
       <w:r>
-        <w:rPr>
-          <w:sz w:val="18"/>
-        </w:rPr>
-        <w:t>[S01] D. Anggraini, K. Adi and J. E. Suseno (2024). Electronic document management systems implementation across industries systematic analysis. Indonesian Journal of Electrical Engineering and Computer Science 36(1), 264–273. https://doi.org/10.11591/ijeecs.v36.i1.pp264-273. Inspected: Publisher abstract and citation record.</w:t>
+        <w:t>[S01] D. Anggraini, K. Adi and J. E. Suseno (2024). Electronic document management systems implementation across industries: systematic analysis. Indonesian Journal of Electrical Engineering and Computer Science 36(1), 264–273. https://doi.org/10.11591/ijeecs.v36.i1.pp264-273. Inspected: Publisher abstract and citation record.</w:t>
       </w:r>
     </w:p>
     <w:p>
@@ -20296,10 +20535,7 @@
         <w:spacing w:after="200"/>
       </w:pPr>
       <w:r>
-        <w:rPr>
-          <w:sz w:val="18"/>
-        </w:rPr>
-        <w:t>[S04] A. K. Y. S. Mohamed, D. Auer, D. Hofer and J. Küng (2022). A systematic literature review for authorization and access control definitions strategies and models. International Journal of Web Information Systems 18(2/3), 156–180. https://doi.org/10.1108/IJWIS-04-2022-0077. Inspected: Publisher abstract and findings summary.</w:t>
+        <w:t>[S04] A. K. Y. S. Mohamed, D. Auer, D. Hofer and J. Küng (2022). A systematic literature review for authorization and access control: definitions, strategies and models. International Journal of Web Information Systems 18(2/3), 156–180. https://doi.org/10.1108/IJWIS-04-2022-0077. Inspected: Publisher abstract and findings summary.</w:t>
       </w:r>
     </w:p>
     <w:p>
@@ -20307,10 +20543,7 @@
         <w:spacing w:after="200"/>
       </w:pPr>
       <w:r>
-        <w:rPr>
-          <w:sz w:val="18"/>
-        </w:rPr>
-        <w:t>[S05] B. Q. Truong, A. Nguyen-Duc and N. T. C. Van (2023). A Quantitative Review of the Research on Business Process Management in Digital Transformation A Bibliometric Approach. Software 2(3), 377–399. https://doi.org/10.3390/software2030018. Inspected: Publisher abstract and methods sections.</w:t>
+        <w:t>[S05] B. Q. Truong, A. Nguyen-Duc and N. T. C. Van (2023). A Quantitative Review of the Research on Business Process Management in Digital Transformation: A Bibliometric Approach. Software 2(3), 377–399. https://doi.org/10.3390/software2030018. Inspected: Publisher abstract and methods sections.</w:t>
       </w:r>
     </w:p>
     <w:p>
@@ -20318,10 +20551,7 @@
         <w:spacing w:after="200"/>
       </w:pPr>
       <w:r>
-        <w:rPr>
-          <w:sz w:val="18"/>
-        </w:rPr>
-        <w:t>[S06] F. Milani, K. Kubrak and J. Nava (2024). Strategic redesign of business processes in the digital age A framework. Data and Knowledge Engineering 154, 102367. https://doi.org/10.1016/j.datak.2024.102367. Inspected: Publisher abstract and conclusion excerpts.</w:t>
+        <w:t>[S06] F. Milani, K. Kubrak and J. Nava (2024). Strategic redesign of business processes in the digital age: A framework. Data and Knowledge Engineering 154, 102367. https://doi.org/10.1016/j.datak.2024.102367. Inspected: Publisher abstract and conclusion excerpts.</w:t>
       </w:r>
     </w:p>
     <w:p>
@@ -20561,6 +20791,18 @@
       <w:pPr/>
       <w:r>
         <w:t>[S30] Documentolog. Первые клиенты уже обновлены на d8n.ai (First customers have been upgraded to d8n.ai), 31 March 2026. https://documentolog.com/blog/pervye-klienty-uzhe-obnovleny-na-d8n-ai. Accessed 23 October 2026. Used for: Vendor-reported migration of Documentolog Platform clients to d8n.ai; does not establish feature equivalence.</w:t>
+      </w:r>
+    </w:p>
+    <w:p>
+      <w:pPr/>
+      <w:r>
+        <w:t>[S31] D. R. John, F.-M. Hsu and Y.-J. Chen (2026). Electronic Records Management Systems: A Literature Review. Information 17(7), 629. https://doi.org/10.3390/info17070629. Inspected: Publisher abstract, methods and discussion sections surfaced by search index, plus Crossref metadata.</w:t>
+      </w:r>
+    </w:p>
+    <w:p>
+      <w:pPr/>
+      <w:r>
+        <w:t>[S32] B. G. Lojonon and R. Alfred (2025). Factors Influencing Digital Adoption of Data and Information Management Methods in the Public Sector. International Journal of Electronic Government Research 21(1), 1–14. https://doi.org/10.4018/IJEGR.389245. Inspected: Indexed article abstract and Crossref metadata; direct publisher landing page rate-limited.</w:t>
       </w:r>
     </w:p>
     <w:sectPr>

</xml_diff>

<commit_message>
EDFS-10: sync verified YouTrack status and report (assistant-prepared; peer review required)
</commit_message>
<xml_diff>
--- a/docs/EDFS_Report.docx
+++ b/docs/EDFS_Report.docx
@@ -69,18 +69,18 @@
         <w:pStyle w:val="Heading2"/>
       </w:pPr>
       <w:r>
-        <w:t>Submission</w:t>
+        <w:t>Preparation status</w:t>
       </w:r>
     </w:p>
     <w:p>
       <w:r>
-        <w:t>24 October 2026</w:t>
+        <w:t>Target first pre-defense: 24 October 2026</w:t>
         <w:br/>
         <w:t>Prepared 19 October 2026</w:t>
         <w:br/>
         <w:t>Updated 24 October 2026</w:t>
         <w:br/>
-        <w:t>Proposed requirements baseline 0.2</w:t>
+        <w:t>Proposed requirements baseline 0.3</w:t>
       </w:r>
     </w:p>
     <w:p>
@@ -16609,7 +16609,7 @@
     </w:p>
     <w:p>
       <w:r>
-        <w:t>The package was prepared with assistance. The interviewer's account documents a real discovery activity but does not establish Git authorship of prepared files. PRs #1, #2 and #3 were merged without submitted peer reviews. PR #4 received an APPROVED submission from Al1GaTorr at 08:03:39 UTC on 24 October, before its merge at 08:03:46 UTC. The review body and inline comments were empty; no review-driven revision is claimed. Later substantive PRs must also receive genuine peer review before merge. No backdated history or invented comment forms part of the submission.</w:t>
+        <w:t>The package was prepared with assistance. The interviewer's account documents a real discovery activity but does not establish Git authorship of prepared files. PRs #1, #2 and #3 were merged without submitted peer reviews. Al1GaTorr submitted APPROVED reviews on PR #4 at 08:03:39 UTC and PR #5 at 08:26:04 UTC on 24 October, each before merge. Both review bodies and inline comments were empty; no review-driven revision is claimed. Later substantive PRs also require genuine peer review before merge. No backdated history or invented comment forms part of the submission.</w:t>
       </w:r>
     </w:p>
     <w:p>
@@ -19181,7 +19181,7 @@
                 <w:color w:val="172B3A"/>
                 <w:sz w:val="17"/>
               </w:rPr>
-              <w:t>Record genuine student edits and review the next substantive PR before merge; PRs #1–#3 lacked submitted peer reviews</w:t>
+              <w:t>Record genuine student edits and the PR #4 and PR #5 approvals; explain unreviewed PRs #1–#3 and the absence of written review comments.</w:t>
             </w:r>
           </w:p>
         </w:tc>
@@ -19207,12 +19207,12 @@
     </w:p>
     <w:p>
       <w:r>
-        <w:t>Use task IDs in branch names and commit or PR descriptions. Add the resulting commit or PR link back to the task. PR #4 has a submitted peer approval before merge; PRs #1–#3 remain historical unreviewed merges. Each later substantive PR requires another student's review before merge. Documentation and diagrams require review too. The repository includes PR and issue templates, a CI workflow and an ignore file. Do not commit passwords, API keys, real participant notes or runtime data.</w:t>
+        <w:t>Use task IDs in branch names and commit or PR descriptions. Add the resulting commit or PR link back to the task. PRs #4 and #5 have submitted peer approvals before merge; PRs #1–#3 remain historical unreviewed merges. Each later substantive PR requires another student's review before merge. Documentation and diagrams require review too. The repository includes PR and issue templates, a CI workflow and an ignore file. Do not commit passwords, API keys, real participant notes or runtime data.</w:t>
       </w:r>
     </w:p>
     <w:p>
       <w:r>
-        <w:t>At this review, PR #4 had been approved by Al1GaTorr before merge, while PRs #1–#3 had no submitted peer reviews. The pre-defense-1 tag was absent. Confirm committee and supervisor access and check repository and YouTrack links. Record actual supervisor feedback and the resulting decisions before tagging the exact reviewed version subsequently submitted. Do not move the tag later or describe earlier unreviewed merges as approved. The PR #4 approval contains no written review comments or documented review-driven revision.</w:t>
+        <w:t>As checked on 24 October, YouTrack lists EDFS-1 through EDFS-10 as Done and EDFS-11 as In Progress for actual supervisor review and submission. The reviewed PR #5 was merged at 08:26:13 UTC as main commit a47c7a2fd039e376573f0fe3f2e8a4fe11c46afb; its prototype workflow check passed. This first-stage task status is not supervisor approval. The pre-defense-1 tag is absent. Confirm committee and supervisor access and record actual feedback before tagging the exact version subsequently submitted. PRs #4 and #5 contain approvals but no written review comments or documented review-driven revisions; do not describe earlier unreviewed merges as approved.</w:t>
       </w:r>
     </w:p>
     <w:p>
@@ -20357,7 +20357,7 @@
           </w:tcPr>
           <w:p>
             <w:r>
-              <w:t>PR #4 received peer approval before merge; PRs #1–#3 remain historically unreviewed. Verify individual contributions, later reviews and actual committee access; tag awaits supervisor feedback.</w:t>
+              <w:t>PRs #4 and #5 received peer approval before merge; ten YouTrack tasks are Done. Disclose PRs #1–#3 without submitted reviews and no written review comments; supervisor access and submission tag remain in EDFS-11.</w:t>
             </w:r>
           </w:p>
         </w:tc>
@@ -20479,12 +20479,12 @@
     </w:p>
     <w:p>
       <w:r>
-        <w:t>This version supplies analysis and design artifacts, ten interviewer-attested user conversations (five selected for direct relevance), and an interactive text-document prototype. It does not provide a production application or measured organisational benefit. Only prototype model tests have been executed; backend, security, performance and user outcome checks remain planned. PR #4 received peer approval before merge; PRs #1–#3 did not, and later substantive changes need their own review. Supervisor feedback and a pre-defense-1 tag are outstanding. A complete application is not required now, but progressive student contributions and real supervision must be demonstrable.</w:t>
+        <w:t>This version supplies analysis and design artifacts, ten interviewer-attested user conversations (five selected for direct relevance), and an interactive text-document prototype. It does not provide a production application or measured organisational benefit. Only prototype model tests have been executed; backend, security, performance and user outcome checks remain planned. PRs #4 and #5 received peer approval before merge; PRs #1–#3 did not. In YouTrack, ten first-stage tasks are Done and EDFS-11 remains In Progress for real supervisor feedback and the submission tag. A complete application is not required now, but progressive student contributions and real supervision must be demonstrable.</w:t>
       </w:r>
     </w:p>
     <w:p>
       <w:r>
-        <w:t>The submission record in management/submission_record.md identifies the actual reviewed PR #4 baseline and leaves the immutable tag, committee access and supervisor fields open until verified. During the demonstration, select one real task and trace its acceptance criteria to an artifact, commit, review and verification result. The PR #4 approval has no written comments, so no review-driven revision is claimed. Each student should explain their own changes and the workflow invariants.</w:t>
+        <w:t>The submission record in management/submission_record.md identifies the reviewed PR #5 baseline and leaves the immutable tag, committee access and supervisor fields open until verified. During the demonstration, select one real task and trace its acceptance criteria to an artifact, commit, review and verification result. The PR #4 and PR #5 approvals have no written comments, so no review-driven revision is claimed. Each student should explain their own changes and the workflow invariants.</w:t>
       </w:r>
     </w:p>
     <w:p>

</xml_diff>